<commit_message>
Registration Window, and VM were added to rep
</commit_message>
<xml_diff>
--- a/КурсоваФайли/Завдання на КР.docx
+++ b/КурсоваФайли/Завдання на КР.docx
@@ -128,6 +128,7 @@
           <w:color w:val="000000"/>
           <w:sz w:val="28"/>
           <w:szCs w:val="28"/>
+          <w:lang w:val="ru-RU"/>
         </w:rPr>
       </w:pPr>
       <w:r>
@@ -144,7 +145,21 @@
           <w:sz w:val="28"/>
           <w:szCs w:val="28"/>
         </w:rPr>
-        <w:t>афедра прикладної математики</w:t>
+        <w:t xml:space="preserve">афедра </w:t>
+      </w:r>
+      <w:r>
+        <w:rPr>
+          <w:sz w:val="28"/>
+          <w:szCs w:val="28"/>
+        </w:rPr>
+        <w:t>п</w:t>
+      </w:r>
+      <w:r>
+        <w:rPr>
+          <w:sz w:val="28"/>
+          <w:szCs w:val="28"/>
+        </w:rPr>
+        <w:t>рограмного забезпечення комп’ютерних систем</w:t>
       </w:r>
     </w:p>
     <w:p>
@@ -259,7 +274,41 @@
           <w:sz w:val="28"/>
           <w:szCs w:val="28"/>
         </w:rPr>
-        <w:t>на виконання курсової роботи з дисципліни</w:t>
+        <w:t>на виконання курсово</w:t>
+      </w:r>
+      <w:r>
+        <w:rPr>
+          <w:b/>
+          <w:sz w:val="28"/>
+          <w:szCs w:val="28"/>
+        </w:rPr>
+        <w:t>го</w:t>
+      </w:r>
+      <w:r>
+        <w:rPr>
+          <w:b/>
+          <w:sz w:val="28"/>
+          <w:szCs w:val="28"/>
+        </w:rPr>
+        <w:t xml:space="preserve"> </w:t>
+      </w:r>
+      <w:proofErr w:type="spellStart"/>
+      <w:r>
+        <w:rPr>
+          <w:b/>
+          <w:sz w:val="28"/>
+          <w:szCs w:val="28"/>
+        </w:rPr>
+        <w:t>проєкту</w:t>
+      </w:r>
+      <w:proofErr w:type="spellEnd"/>
+      <w:r>
+        <w:rPr>
+          <w:b/>
+          <w:sz w:val="28"/>
+          <w:szCs w:val="28"/>
+        </w:rPr>
+        <w:t xml:space="preserve"> з дисципліни</w:t>
       </w:r>
     </w:p>
     <w:p>
@@ -412,7 +461,7 @@
           <w:between w:val="nil"/>
         </w:pBdr>
         <w:tabs>
-          <w:tab w:val="left" w:pos="1066"/>
+          <w:tab w:val="left" w:pos="284"/>
           <w:tab w:val="left" w:pos="1999"/>
           <w:tab w:val="left" w:pos="3236"/>
           <w:tab w:val="left" w:pos="4655"/>
@@ -421,7 +470,8 @@
           <w:tab w:val="left" w:pos="7979"/>
         </w:tabs>
         <w:spacing w:before="2" w:line="360" w:lineRule="auto"/>
-        <w:ind w:left="0" w:right="271" w:firstLine="567"/>
+        <w:ind w:left="0" w:right="271" w:firstLine="0"/>
+        <w:jc w:val="both"/>
         <w:rPr>
           <w:color w:val="000000"/>
           <w:sz w:val="28"/>
@@ -444,17 +494,25 @@
           <w:sz w:val="28"/>
           <w:szCs w:val="28"/>
         </w:rPr>
+        <w:t xml:space="preserve"> </w:t>
+      </w:r>
+      <w:r>
+        <w:rPr>
+          <w:b/>
+          <w:color w:val="000000"/>
+          <w:sz w:val="28"/>
+          <w:szCs w:val="28"/>
+        </w:rPr>
+        <w:t>роботи.</w:t>
+      </w:r>
+      <w:r>
+        <w:rPr>
+          <w:b/>
+          <w:color w:val="000000"/>
+          <w:sz w:val="28"/>
+          <w:szCs w:val="28"/>
+        </w:rPr>
         <w:tab/>
-        <w:t>роботи.</w:t>
-      </w:r>
-      <w:r>
-        <w:rPr>
-          <w:b/>
-          <w:color w:val="000000"/>
-          <w:sz w:val="28"/>
-          <w:szCs w:val="28"/>
-        </w:rPr>
-        <w:tab/>
       </w:r>
       <w:r>
         <w:rPr>
@@ -488,7 +546,7 @@
           <w:sz w:val="28"/>
           <w:szCs w:val="28"/>
         </w:rPr>
-        <w:br/>
+        <w:t xml:space="preserve"> </w:t>
       </w:r>
       <w:proofErr w:type="spellStart"/>
       <w:r>
@@ -541,7 +599,7 @@
           <w:between w:val="nil"/>
         </w:pBdr>
         <w:tabs>
-          <w:tab w:val="left" w:pos="1066"/>
+          <w:tab w:val="left" w:pos="284"/>
           <w:tab w:val="left" w:pos="1999"/>
           <w:tab w:val="left" w:pos="3236"/>
           <w:tab w:val="left" w:pos="4655"/>
@@ -550,7 +608,8 @@
           <w:tab w:val="left" w:pos="7979"/>
         </w:tabs>
         <w:spacing w:before="2" w:line="360" w:lineRule="auto"/>
-        <w:ind w:left="0" w:right="271" w:firstLine="567"/>
+        <w:ind w:left="0" w:right="271" w:firstLine="0"/>
+        <w:jc w:val="both"/>
         <w:rPr>
           <w:color w:val="000000"/>
           <w:sz w:val="28"/>
@@ -591,6 +650,1632 @@
           <w:szCs w:val="28"/>
         </w:rPr>
         <w:t>“___” _____2026 р.</w:t>
+      </w:r>
+    </w:p>
+    <w:p>
+      <w:pPr>
+        <w:numPr>
+          <w:ilvl w:val="1"/>
+          <w:numId w:val="2"/>
+        </w:numPr>
+        <w:pBdr>
+          <w:top w:val="nil"/>
+          <w:left w:val="nil"/>
+          <w:bottom w:val="nil"/>
+          <w:right w:val="nil"/>
+          <w:between w:val="nil"/>
+        </w:pBdr>
+        <w:tabs>
+          <w:tab w:val="left" w:pos="284"/>
+        </w:tabs>
+        <w:spacing w:before="160" w:line="360" w:lineRule="auto"/>
+        <w:ind w:left="0" w:firstLine="0"/>
+        <w:jc w:val="both"/>
+        <w:rPr>
+          <w:color w:val="000000"/>
+          <w:sz w:val="28"/>
+          <w:szCs w:val="28"/>
+        </w:rPr>
+      </w:pPr>
+      <w:r>
+        <w:rPr>
+          <w:b/>
+          <w:color w:val="000000"/>
+          <w:sz w:val="28"/>
+          <w:szCs w:val="28"/>
+        </w:rPr>
+        <w:t xml:space="preserve">Вихідні дані для роботи: </w:t>
+      </w:r>
+      <w:r>
+        <w:rPr>
+          <w:color w:val="000000"/>
+          <w:sz w:val="28"/>
+          <w:szCs w:val="28"/>
+        </w:rPr>
+        <w:t>див. Технічне завдання.</w:t>
+      </w:r>
+    </w:p>
+    <w:p>
+      <w:pPr>
+        <w:numPr>
+          <w:ilvl w:val="1"/>
+          <w:numId w:val="2"/>
+        </w:numPr>
+        <w:pBdr>
+          <w:top w:val="nil"/>
+          <w:left w:val="nil"/>
+          <w:bottom w:val="nil"/>
+          <w:right w:val="nil"/>
+          <w:between w:val="nil"/>
+        </w:pBdr>
+        <w:tabs>
+          <w:tab w:val="left" w:pos="284"/>
+        </w:tabs>
+        <w:spacing w:before="161" w:line="360" w:lineRule="auto"/>
+        <w:ind w:left="0" w:firstLine="0"/>
+        <w:jc w:val="both"/>
+        <w:rPr>
+          <w:b/>
+          <w:color w:val="000000"/>
+          <w:sz w:val="28"/>
+          <w:szCs w:val="28"/>
+        </w:rPr>
+      </w:pPr>
+      <w:r>
+        <w:rPr>
+          <w:b/>
+          <w:color w:val="000000"/>
+          <w:sz w:val="28"/>
+          <w:szCs w:val="28"/>
+        </w:rPr>
+        <w:t>Перелік завдань, які мають бути вирішені:</w:t>
+      </w:r>
+    </w:p>
+    <w:p>
+      <w:pPr>
+        <w:pStyle w:val="ListParagraph"/>
+        <w:numPr>
+          <w:ilvl w:val="0"/>
+          <w:numId w:val="4"/>
+        </w:numPr>
+        <w:spacing w:line="360" w:lineRule="auto"/>
+        <w:jc w:val="both"/>
+        <w:rPr>
+          <w:sz w:val="28"/>
+          <w:szCs w:val="28"/>
+          <w:lang w:val="ru-RU" w:eastAsia="en-US" w:bidi="ar-SA"/>
+        </w:rPr>
+      </w:pPr>
+      <w:r>
+        <w:rPr>
+          <w:sz w:val="28"/>
+          <w:szCs w:val="28"/>
+          <w:lang w:val="ru-RU" w:eastAsia="en-US" w:bidi="ar-SA"/>
+        </w:rPr>
+        <w:t xml:space="preserve">за </w:t>
+      </w:r>
+      <w:proofErr w:type="spellStart"/>
+      <w:r>
+        <w:rPr>
+          <w:sz w:val="28"/>
+          <w:szCs w:val="28"/>
+          <w:lang w:val="ru-RU" w:eastAsia="en-US" w:bidi="ar-SA"/>
+        </w:rPr>
+        <w:t>допомогою</w:t>
+      </w:r>
+      <w:proofErr w:type="spellEnd"/>
+      <w:r>
+        <w:rPr>
+          <w:sz w:val="28"/>
+          <w:szCs w:val="28"/>
+          <w:lang w:val="ru-RU" w:eastAsia="en-US" w:bidi="ar-SA"/>
+        </w:rPr>
+        <w:t xml:space="preserve"> </w:t>
+      </w:r>
+      <w:proofErr w:type="spellStart"/>
+      <w:r>
+        <w:rPr>
+          <w:sz w:val="28"/>
+          <w:szCs w:val="28"/>
+          <w:lang w:val="ru-RU" w:eastAsia="en-US" w:bidi="ar-SA"/>
+        </w:rPr>
+        <w:t>принципів</w:t>
+      </w:r>
+      <w:proofErr w:type="spellEnd"/>
+      <w:r>
+        <w:rPr>
+          <w:sz w:val="28"/>
+          <w:szCs w:val="28"/>
+          <w:lang w:val="ru-RU" w:eastAsia="en-US" w:bidi="ar-SA"/>
+        </w:rPr>
+        <w:t xml:space="preserve"> ООП </w:t>
+      </w:r>
+      <w:proofErr w:type="spellStart"/>
+      <w:r>
+        <w:rPr>
+          <w:sz w:val="28"/>
+          <w:szCs w:val="28"/>
+          <w:lang w:val="ru-RU" w:eastAsia="en-US" w:bidi="ar-SA"/>
+        </w:rPr>
+        <w:t>розробити</w:t>
+      </w:r>
+      <w:proofErr w:type="spellEnd"/>
+      <w:r>
+        <w:rPr>
+          <w:sz w:val="28"/>
+          <w:szCs w:val="28"/>
+          <w:lang w:val="ru-RU" w:eastAsia="en-US" w:bidi="ar-SA"/>
+        </w:rPr>
+        <w:t xml:space="preserve"> </w:t>
+      </w:r>
+      <w:proofErr w:type="spellStart"/>
+      <w:r>
+        <w:rPr>
+          <w:sz w:val="28"/>
+          <w:szCs w:val="28"/>
+          <w:lang w:val="ru-RU" w:eastAsia="en-US" w:bidi="ar-SA"/>
+        </w:rPr>
+        <w:t>багатошарову</w:t>
+      </w:r>
+      <w:proofErr w:type="spellEnd"/>
+      <w:r>
+        <w:rPr>
+          <w:sz w:val="28"/>
+          <w:szCs w:val="28"/>
+          <w:lang w:val="ru-RU" w:eastAsia="en-US" w:bidi="ar-SA"/>
+        </w:rPr>
+        <w:t xml:space="preserve"> </w:t>
+      </w:r>
+      <w:proofErr w:type="spellStart"/>
+      <w:r>
+        <w:rPr>
+          <w:sz w:val="28"/>
+          <w:szCs w:val="28"/>
+          <w:lang w:val="ru-RU" w:eastAsia="en-US" w:bidi="ar-SA"/>
+        </w:rPr>
+        <w:t>архітектуру</w:t>
+      </w:r>
+      <w:proofErr w:type="spellEnd"/>
+      <w:r>
+        <w:rPr>
+          <w:sz w:val="28"/>
+          <w:szCs w:val="28"/>
+          <w:lang w:val="ru-RU" w:eastAsia="en-US" w:bidi="ar-SA"/>
+        </w:rPr>
+        <w:t xml:space="preserve"> </w:t>
+      </w:r>
+      <w:proofErr w:type="spellStart"/>
+      <w:r>
+        <w:rPr>
+          <w:sz w:val="28"/>
+          <w:szCs w:val="28"/>
+          <w:lang w:val="ru-RU" w:eastAsia="en-US" w:bidi="ar-SA"/>
+        </w:rPr>
+        <w:t>програмного</w:t>
+      </w:r>
+      <w:proofErr w:type="spellEnd"/>
+      <w:r>
+        <w:rPr>
+          <w:sz w:val="28"/>
+          <w:szCs w:val="28"/>
+          <w:lang w:val="ru-RU" w:eastAsia="en-US" w:bidi="ar-SA"/>
+        </w:rPr>
+        <w:t xml:space="preserve"> </w:t>
+      </w:r>
+      <w:proofErr w:type="spellStart"/>
+      <w:r>
+        <w:rPr>
+          <w:sz w:val="28"/>
+          <w:szCs w:val="28"/>
+          <w:lang w:val="ru-RU" w:eastAsia="en-US" w:bidi="ar-SA"/>
+        </w:rPr>
+        <w:t>забезпечення</w:t>
+      </w:r>
+      <w:proofErr w:type="spellEnd"/>
+      <w:r>
+        <w:rPr>
+          <w:sz w:val="28"/>
+          <w:szCs w:val="28"/>
+          <w:lang w:val="ru-RU" w:eastAsia="en-US" w:bidi="ar-SA"/>
+        </w:rPr>
+        <w:t xml:space="preserve">; </w:t>
+      </w:r>
+    </w:p>
+    <w:p>
+      <w:pPr>
+        <w:pStyle w:val="ListParagraph"/>
+        <w:numPr>
+          <w:ilvl w:val="0"/>
+          <w:numId w:val="4"/>
+        </w:numPr>
+        <w:spacing w:line="360" w:lineRule="auto"/>
+        <w:jc w:val="both"/>
+        <w:rPr>
+          <w:sz w:val="28"/>
+          <w:szCs w:val="28"/>
+          <w:lang w:val="ru-RU" w:eastAsia="en-US" w:bidi="ar-SA"/>
+        </w:rPr>
+      </w:pPr>
+      <w:proofErr w:type="spellStart"/>
+      <w:r>
+        <w:rPr>
+          <w:sz w:val="28"/>
+          <w:szCs w:val="28"/>
+          <w:lang w:val="ru-RU" w:eastAsia="en-US" w:bidi="ar-SA"/>
+        </w:rPr>
+        <w:t>реалізувати</w:t>
+      </w:r>
+      <w:proofErr w:type="spellEnd"/>
+      <w:r>
+        <w:rPr>
+          <w:sz w:val="28"/>
+          <w:szCs w:val="28"/>
+          <w:lang w:val="ru-RU" w:eastAsia="en-US" w:bidi="ar-SA"/>
+        </w:rPr>
+        <w:t xml:space="preserve"> систему </w:t>
+      </w:r>
+      <w:r>
+        <w:rPr>
+          <w:sz w:val="28"/>
+          <w:szCs w:val="28"/>
+          <w:lang w:val="en-US" w:eastAsia="en-US" w:bidi="ar-SA"/>
+        </w:rPr>
+        <w:t>Login</w:t>
+      </w:r>
+      <w:r>
+        <w:rPr>
+          <w:sz w:val="28"/>
+          <w:szCs w:val="28"/>
+          <w:lang w:val="ru-RU" w:eastAsia="en-US" w:bidi="ar-SA"/>
+        </w:rPr>
+        <w:t xml:space="preserve"> </w:t>
+      </w:r>
+      <w:r>
+        <w:rPr>
+          <w:sz w:val="28"/>
+          <w:szCs w:val="28"/>
+          <w:lang w:val="en-US" w:eastAsia="en-US" w:bidi="ar-SA"/>
+        </w:rPr>
+        <w:t>Transition</w:t>
+      </w:r>
+      <w:r>
+        <w:rPr>
+          <w:sz w:val="28"/>
+          <w:szCs w:val="28"/>
+          <w:lang w:val="ru-RU" w:eastAsia="en-US" w:bidi="ar-SA"/>
+        </w:rPr>
+        <w:t xml:space="preserve"> </w:t>
+      </w:r>
+      <w:proofErr w:type="spellStart"/>
+      <w:r>
+        <w:rPr>
+          <w:sz w:val="28"/>
+          <w:szCs w:val="28"/>
+          <w:lang w:val="ru-RU" w:eastAsia="en-US" w:bidi="ar-SA"/>
+        </w:rPr>
+        <w:t>із</w:t>
+      </w:r>
+      <w:proofErr w:type="spellEnd"/>
+      <w:r>
+        <w:rPr>
+          <w:sz w:val="28"/>
+          <w:szCs w:val="28"/>
+          <w:lang w:val="ru-RU" w:eastAsia="en-US" w:bidi="ar-SA"/>
+        </w:rPr>
+        <w:t xml:space="preserve"> </w:t>
+      </w:r>
+      <w:proofErr w:type="spellStart"/>
+      <w:r>
+        <w:rPr>
+          <w:sz w:val="28"/>
+          <w:szCs w:val="28"/>
+          <w:lang w:val="ru-RU" w:eastAsia="en-US" w:bidi="ar-SA"/>
+        </w:rPr>
+        <w:t>використанням</w:t>
+      </w:r>
+      <w:proofErr w:type="spellEnd"/>
+      <w:r>
+        <w:rPr>
+          <w:sz w:val="28"/>
+          <w:szCs w:val="28"/>
+          <w:lang w:val="ru-RU" w:eastAsia="en-US" w:bidi="ar-SA"/>
+        </w:rPr>
+        <w:t xml:space="preserve"> </w:t>
+      </w:r>
+      <w:r>
+        <w:rPr>
+          <w:sz w:val="28"/>
+          <w:szCs w:val="28"/>
+          <w:lang w:val="en-US" w:eastAsia="en-US" w:bidi="ar-SA"/>
+        </w:rPr>
+        <w:t>WPF</w:t>
+      </w:r>
+      <w:r>
+        <w:rPr>
+          <w:sz w:val="28"/>
+          <w:szCs w:val="28"/>
+          <w:lang w:val="ru-RU" w:eastAsia="en-US" w:bidi="ar-SA"/>
+        </w:rPr>
+        <w:t xml:space="preserve"> та </w:t>
+      </w:r>
+      <w:r>
+        <w:rPr>
+          <w:sz w:val="28"/>
+          <w:szCs w:val="28"/>
+          <w:lang w:val="en-US" w:eastAsia="en-US" w:bidi="ar-SA"/>
+        </w:rPr>
+        <w:t>MVVM</w:t>
+      </w:r>
+      <w:r>
+        <w:rPr>
+          <w:sz w:val="28"/>
+          <w:szCs w:val="28"/>
+          <w:lang w:val="ru-RU" w:eastAsia="en-US" w:bidi="ar-SA"/>
+        </w:rPr>
+        <w:t xml:space="preserve">; </w:t>
+      </w:r>
+    </w:p>
+    <w:p>
+      <w:pPr>
+        <w:pStyle w:val="ListParagraph"/>
+        <w:numPr>
+          <w:ilvl w:val="0"/>
+          <w:numId w:val="4"/>
+        </w:numPr>
+        <w:spacing w:line="360" w:lineRule="auto"/>
+        <w:jc w:val="both"/>
+        <w:rPr>
+          <w:sz w:val="28"/>
+          <w:szCs w:val="28"/>
+          <w:lang w:val="en-US" w:eastAsia="en-US" w:bidi="ar-SA"/>
+        </w:rPr>
+      </w:pPr>
+      <w:proofErr w:type="spellStart"/>
+      <w:r>
+        <w:rPr>
+          <w:sz w:val="28"/>
+          <w:szCs w:val="28"/>
+          <w:lang w:val="en-US" w:eastAsia="en-US" w:bidi="ar-SA"/>
+        </w:rPr>
+        <w:t>розробити</w:t>
+      </w:r>
+      <w:proofErr w:type="spellEnd"/>
+      <w:r>
+        <w:rPr>
+          <w:sz w:val="28"/>
+          <w:szCs w:val="28"/>
+          <w:lang w:val="en-US" w:eastAsia="en-US" w:bidi="ar-SA"/>
+        </w:rPr>
+        <w:t xml:space="preserve"> </w:t>
+      </w:r>
+      <w:proofErr w:type="spellStart"/>
+      <w:r>
+        <w:rPr>
+          <w:sz w:val="28"/>
+          <w:szCs w:val="28"/>
+          <w:lang w:val="en-US" w:eastAsia="en-US" w:bidi="ar-SA"/>
+        </w:rPr>
+        <w:t>структурну</w:t>
+      </w:r>
+      <w:proofErr w:type="spellEnd"/>
+      <w:r>
+        <w:rPr>
+          <w:sz w:val="28"/>
+          <w:szCs w:val="28"/>
+          <w:lang w:val="en-US" w:eastAsia="en-US" w:bidi="ar-SA"/>
+        </w:rPr>
+        <w:t xml:space="preserve"> </w:t>
+      </w:r>
+      <w:proofErr w:type="spellStart"/>
+      <w:r>
+        <w:rPr>
+          <w:sz w:val="28"/>
+          <w:szCs w:val="28"/>
+          <w:lang w:val="en-US" w:eastAsia="en-US" w:bidi="ar-SA"/>
+        </w:rPr>
+        <w:t>організацію</w:t>
+      </w:r>
+      <w:proofErr w:type="spellEnd"/>
+      <w:r>
+        <w:rPr>
+          <w:sz w:val="28"/>
+          <w:szCs w:val="28"/>
+          <w:lang w:val="en-US" w:eastAsia="en-US" w:bidi="ar-SA"/>
+        </w:rPr>
+        <w:t xml:space="preserve"> </w:t>
+      </w:r>
+      <w:proofErr w:type="spellStart"/>
+      <w:r>
+        <w:rPr>
+          <w:sz w:val="28"/>
+          <w:szCs w:val="28"/>
+          <w:lang w:val="en-US" w:eastAsia="en-US" w:bidi="ar-SA"/>
+        </w:rPr>
+        <w:t>застосунку</w:t>
+      </w:r>
+      <w:proofErr w:type="spellEnd"/>
+      <w:r>
+        <w:rPr>
+          <w:sz w:val="28"/>
+          <w:szCs w:val="28"/>
+          <w:lang w:val="en-US" w:eastAsia="en-US" w:bidi="ar-SA"/>
+        </w:rPr>
+        <w:t xml:space="preserve"> </w:t>
+      </w:r>
+      <w:proofErr w:type="spellStart"/>
+      <w:r>
+        <w:rPr>
+          <w:sz w:val="28"/>
+          <w:szCs w:val="28"/>
+          <w:lang w:val="en-US" w:eastAsia="en-US" w:bidi="ar-SA"/>
+        </w:rPr>
+        <w:t>та</w:t>
+      </w:r>
+      <w:proofErr w:type="spellEnd"/>
+      <w:r>
+        <w:rPr>
+          <w:sz w:val="28"/>
+          <w:szCs w:val="28"/>
+          <w:lang w:val="en-US" w:eastAsia="en-US" w:bidi="ar-SA"/>
+        </w:rPr>
+        <w:t xml:space="preserve"> </w:t>
+      </w:r>
+      <w:proofErr w:type="spellStart"/>
+      <w:r>
+        <w:rPr>
+          <w:sz w:val="28"/>
+          <w:szCs w:val="28"/>
+          <w:lang w:val="en-US" w:eastAsia="en-US" w:bidi="ar-SA"/>
+        </w:rPr>
+        <w:t>взаємодію</w:t>
+      </w:r>
+      <w:proofErr w:type="spellEnd"/>
+      <w:r>
+        <w:rPr>
+          <w:sz w:val="28"/>
+          <w:szCs w:val="28"/>
+          <w:lang w:val="en-US" w:eastAsia="en-US" w:bidi="ar-SA"/>
+        </w:rPr>
+        <w:t xml:space="preserve"> </w:t>
+      </w:r>
+      <w:proofErr w:type="spellStart"/>
+      <w:r>
+        <w:rPr>
+          <w:sz w:val="28"/>
+          <w:szCs w:val="28"/>
+          <w:lang w:val="en-US" w:eastAsia="en-US" w:bidi="ar-SA"/>
+        </w:rPr>
+        <w:t>між</w:t>
+      </w:r>
+      <w:proofErr w:type="spellEnd"/>
+      <w:r>
+        <w:rPr>
+          <w:sz w:val="28"/>
+          <w:szCs w:val="28"/>
+          <w:lang w:val="en-US" w:eastAsia="en-US" w:bidi="ar-SA"/>
+        </w:rPr>
+        <w:t xml:space="preserve"> Presentation Layer, Business Logic Layer, Data Processing Layer </w:t>
+      </w:r>
+      <w:proofErr w:type="spellStart"/>
+      <w:r>
+        <w:rPr>
+          <w:sz w:val="28"/>
+          <w:szCs w:val="28"/>
+          <w:lang w:val="en-US" w:eastAsia="en-US" w:bidi="ar-SA"/>
+        </w:rPr>
+        <w:t>та</w:t>
+      </w:r>
+      <w:proofErr w:type="spellEnd"/>
+      <w:r>
+        <w:rPr>
+          <w:sz w:val="28"/>
+          <w:szCs w:val="28"/>
+          <w:lang w:val="en-US" w:eastAsia="en-US" w:bidi="ar-SA"/>
+        </w:rPr>
+        <w:t xml:space="preserve"> Data Access Layer; </w:t>
+      </w:r>
+    </w:p>
+    <w:p>
+      <w:pPr>
+        <w:pStyle w:val="ListParagraph"/>
+        <w:numPr>
+          <w:ilvl w:val="0"/>
+          <w:numId w:val="4"/>
+        </w:numPr>
+        <w:spacing w:line="360" w:lineRule="auto"/>
+        <w:jc w:val="both"/>
+        <w:rPr>
+          <w:sz w:val="28"/>
+          <w:szCs w:val="28"/>
+          <w:lang w:val="ru-RU" w:eastAsia="en-US" w:bidi="ar-SA"/>
+        </w:rPr>
+      </w:pPr>
+      <w:proofErr w:type="spellStart"/>
+      <w:r>
+        <w:rPr>
+          <w:sz w:val="28"/>
+          <w:szCs w:val="28"/>
+          <w:lang w:val="ru-RU" w:eastAsia="en-US" w:bidi="ar-SA"/>
+        </w:rPr>
+        <w:lastRenderedPageBreak/>
+        <w:t>обґрунтувати</w:t>
+      </w:r>
+      <w:proofErr w:type="spellEnd"/>
+      <w:r>
+        <w:rPr>
+          <w:sz w:val="28"/>
+          <w:szCs w:val="28"/>
+          <w:lang w:val="ru-RU" w:eastAsia="en-US" w:bidi="ar-SA"/>
+        </w:rPr>
+        <w:t xml:space="preserve"> </w:t>
+      </w:r>
+      <w:proofErr w:type="spellStart"/>
+      <w:r>
+        <w:rPr>
+          <w:sz w:val="28"/>
+          <w:szCs w:val="28"/>
+          <w:lang w:val="ru-RU" w:eastAsia="en-US" w:bidi="ar-SA"/>
+        </w:rPr>
+        <w:t>вибір</w:t>
+      </w:r>
+      <w:proofErr w:type="spellEnd"/>
+      <w:r>
+        <w:rPr>
+          <w:sz w:val="28"/>
+          <w:szCs w:val="28"/>
+          <w:lang w:val="ru-RU" w:eastAsia="en-US" w:bidi="ar-SA"/>
+        </w:rPr>
+        <w:t xml:space="preserve"> </w:t>
+      </w:r>
+      <w:proofErr w:type="spellStart"/>
+      <w:r>
+        <w:rPr>
+          <w:sz w:val="28"/>
+          <w:szCs w:val="28"/>
+          <w:lang w:val="ru-RU" w:eastAsia="en-US" w:bidi="ar-SA"/>
+        </w:rPr>
+        <w:t>шаблонів</w:t>
+      </w:r>
+      <w:proofErr w:type="spellEnd"/>
+      <w:r>
+        <w:rPr>
+          <w:sz w:val="28"/>
+          <w:szCs w:val="28"/>
+          <w:lang w:val="ru-RU" w:eastAsia="en-US" w:bidi="ar-SA"/>
+        </w:rPr>
+        <w:t xml:space="preserve"> </w:t>
+      </w:r>
+      <w:proofErr w:type="spellStart"/>
+      <w:r>
+        <w:rPr>
+          <w:sz w:val="28"/>
+          <w:szCs w:val="28"/>
+          <w:lang w:val="ru-RU" w:eastAsia="en-US" w:bidi="ar-SA"/>
+        </w:rPr>
+        <w:t>проєктування</w:t>
+      </w:r>
+      <w:proofErr w:type="spellEnd"/>
+      <w:r>
+        <w:rPr>
+          <w:sz w:val="28"/>
+          <w:szCs w:val="28"/>
+          <w:lang w:val="ru-RU" w:eastAsia="en-US" w:bidi="ar-SA"/>
+        </w:rPr>
+        <w:t xml:space="preserve"> та </w:t>
+      </w:r>
+      <w:proofErr w:type="spellStart"/>
+      <w:r>
+        <w:rPr>
+          <w:sz w:val="28"/>
+          <w:szCs w:val="28"/>
+          <w:lang w:val="ru-RU" w:eastAsia="en-US" w:bidi="ar-SA"/>
+        </w:rPr>
+        <w:t>описати</w:t>
+      </w:r>
+      <w:proofErr w:type="spellEnd"/>
+      <w:r>
+        <w:rPr>
+          <w:sz w:val="28"/>
+          <w:szCs w:val="28"/>
+          <w:lang w:val="ru-RU" w:eastAsia="en-US" w:bidi="ar-SA"/>
+        </w:rPr>
+        <w:t xml:space="preserve"> </w:t>
+      </w:r>
+      <w:proofErr w:type="spellStart"/>
+      <w:r>
+        <w:rPr>
+          <w:sz w:val="28"/>
+          <w:szCs w:val="28"/>
+          <w:lang w:val="ru-RU" w:eastAsia="en-US" w:bidi="ar-SA"/>
+        </w:rPr>
+        <w:t>їх</w:t>
+      </w:r>
+      <w:proofErr w:type="spellEnd"/>
+      <w:r>
+        <w:rPr>
+          <w:sz w:val="28"/>
+          <w:szCs w:val="28"/>
+          <w:lang w:val="ru-RU" w:eastAsia="en-US" w:bidi="ar-SA"/>
+        </w:rPr>
+        <w:t xml:space="preserve"> </w:t>
+      </w:r>
+      <w:proofErr w:type="spellStart"/>
+      <w:r>
+        <w:rPr>
+          <w:sz w:val="28"/>
+          <w:szCs w:val="28"/>
+          <w:lang w:val="ru-RU" w:eastAsia="en-US" w:bidi="ar-SA"/>
+        </w:rPr>
+        <w:t>використання</w:t>
+      </w:r>
+      <w:proofErr w:type="spellEnd"/>
+      <w:r>
+        <w:rPr>
+          <w:sz w:val="28"/>
+          <w:szCs w:val="28"/>
+          <w:lang w:val="ru-RU" w:eastAsia="en-US" w:bidi="ar-SA"/>
+        </w:rPr>
+        <w:t xml:space="preserve"> у </w:t>
+      </w:r>
+      <w:proofErr w:type="spellStart"/>
+      <w:r>
+        <w:rPr>
+          <w:sz w:val="28"/>
+          <w:szCs w:val="28"/>
+          <w:lang w:val="ru-RU" w:eastAsia="en-US" w:bidi="ar-SA"/>
+        </w:rPr>
+        <w:t>програмному</w:t>
+      </w:r>
+      <w:proofErr w:type="spellEnd"/>
+      <w:r>
+        <w:rPr>
+          <w:sz w:val="28"/>
+          <w:szCs w:val="28"/>
+          <w:lang w:val="ru-RU" w:eastAsia="en-US" w:bidi="ar-SA"/>
+        </w:rPr>
+        <w:t xml:space="preserve"> </w:t>
+      </w:r>
+      <w:proofErr w:type="spellStart"/>
+      <w:r>
+        <w:rPr>
+          <w:sz w:val="28"/>
+          <w:szCs w:val="28"/>
+          <w:lang w:val="ru-RU" w:eastAsia="en-US" w:bidi="ar-SA"/>
+        </w:rPr>
+        <w:t>забезпеченні</w:t>
+      </w:r>
+      <w:proofErr w:type="spellEnd"/>
+      <w:r>
+        <w:rPr>
+          <w:sz w:val="28"/>
+          <w:szCs w:val="28"/>
+          <w:lang w:val="ru-RU" w:eastAsia="en-US" w:bidi="ar-SA"/>
+        </w:rPr>
+        <w:t xml:space="preserve">; </w:t>
+      </w:r>
+    </w:p>
+    <w:p>
+      <w:pPr>
+        <w:pStyle w:val="ListParagraph"/>
+        <w:numPr>
+          <w:ilvl w:val="0"/>
+          <w:numId w:val="4"/>
+        </w:numPr>
+        <w:spacing w:line="360" w:lineRule="auto"/>
+        <w:jc w:val="both"/>
+        <w:rPr>
+          <w:sz w:val="28"/>
+          <w:szCs w:val="28"/>
+          <w:lang w:val="en-US" w:eastAsia="en-US" w:bidi="ar-SA"/>
+        </w:rPr>
+      </w:pPr>
+      <w:proofErr w:type="spellStart"/>
+      <w:r>
+        <w:rPr>
+          <w:sz w:val="28"/>
+          <w:szCs w:val="28"/>
+          <w:lang w:val="en-US" w:eastAsia="en-US" w:bidi="ar-SA"/>
+        </w:rPr>
+        <w:t>реалізувати</w:t>
+      </w:r>
+      <w:proofErr w:type="spellEnd"/>
+      <w:r>
+        <w:rPr>
+          <w:sz w:val="28"/>
+          <w:szCs w:val="28"/>
+          <w:lang w:val="en-US" w:eastAsia="en-US" w:bidi="ar-SA"/>
+        </w:rPr>
+        <w:t xml:space="preserve"> </w:t>
+      </w:r>
+      <w:proofErr w:type="spellStart"/>
+      <w:r>
+        <w:rPr>
+          <w:sz w:val="28"/>
+          <w:szCs w:val="28"/>
+          <w:lang w:val="en-US" w:eastAsia="en-US" w:bidi="ar-SA"/>
+        </w:rPr>
+        <w:t>шаблони</w:t>
+      </w:r>
+      <w:proofErr w:type="spellEnd"/>
+      <w:r>
+        <w:rPr>
+          <w:sz w:val="28"/>
+          <w:szCs w:val="28"/>
+          <w:lang w:val="en-US" w:eastAsia="en-US" w:bidi="ar-SA"/>
+        </w:rPr>
+        <w:t xml:space="preserve"> </w:t>
+      </w:r>
+      <w:proofErr w:type="spellStart"/>
+      <w:r>
+        <w:rPr>
+          <w:sz w:val="28"/>
+          <w:szCs w:val="28"/>
+          <w:lang w:val="en-US" w:eastAsia="en-US" w:bidi="ar-SA"/>
+        </w:rPr>
+        <w:t>проєктування</w:t>
+      </w:r>
+      <w:proofErr w:type="spellEnd"/>
+      <w:r>
+        <w:rPr>
+          <w:sz w:val="28"/>
+          <w:szCs w:val="28"/>
+          <w:lang w:val="en-US" w:eastAsia="en-US" w:bidi="ar-SA"/>
+        </w:rPr>
+        <w:t>:</w:t>
+      </w:r>
+    </w:p>
+    <w:p>
+      <w:pPr>
+        <w:pStyle w:val="ListParagraph"/>
+        <w:numPr>
+          <w:ilvl w:val="1"/>
+          <w:numId w:val="5"/>
+        </w:numPr>
+        <w:spacing w:line="360" w:lineRule="auto"/>
+        <w:jc w:val="both"/>
+        <w:rPr>
+          <w:sz w:val="28"/>
+          <w:szCs w:val="28"/>
+          <w:lang w:val="en-US" w:eastAsia="en-US" w:bidi="ar-SA"/>
+        </w:rPr>
+      </w:pPr>
+      <w:r>
+        <w:rPr>
+          <w:sz w:val="28"/>
+          <w:szCs w:val="28"/>
+          <w:lang w:val="en-US" w:eastAsia="en-US" w:bidi="ar-SA"/>
+        </w:rPr>
+        <w:t xml:space="preserve">Builder; </w:t>
+      </w:r>
+    </w:p>
+    <w:p>
+      <w:pPr>
+        <w:pStyle w:val="ListParagraph"/>
+        <w:numPr>
+          <w:ilvl w:val="1"/>
+          <w:numId w:val="5"/>
+        </w:numPr>
+        <w:spacing w:line="360" w:lineRule="auto"/>
+        <w:jc w:val="both"/>
+        <w:rPr>
+          <w:sz w:val="28"/>
+          <w:szCs w:val="28"/>
+          <w:lang w:val="en-US" w:eastAsia="en-US" w:bidi="ar-SA"/>
+        </w:rPr>
+      </w:pPr>
+      <w:r>
+        <w:rPr>
+          <w:sz w:val="28"/>
+          <w:szCs w:val="28"/>
+          <w:lang w:val="en-US" w:eastAsia="en-US" w:bidi="ar-SA"/>
+        </w:rPr>
+        <w:t xml:space="preserve">Factory Method; </w:t>
+      </w:r>
+    </w:p>
+    <w:p>
+      <w:pPr>
+        <w:pStyle w:val="ListParagraph"/>
+        <w:numPr>
+          <w:ilvl w:val="1"/>
+          <w:numId w:val="5"/>
+        </w:numPr>
+        <w:spacing w:line="360" w:lineRule="auto"/>
+        <w:jc w:val="both"/>
+        <w:rPr>
+          <w:sz w:val="28"/>
+          <w:szCs w:val="28"/>
+          <w:lang w:val="en-US" w:eastAsia="en-US" w:bidi="ar-SA"/>
+        </w:rPr>
+      </w:pPr>
+      <w:r>
+        <w:rPr>
+          <w:sz w:val="28"/>
+          <w:szCs w:val="28"/>
+          <w:lang w:val="en-US" w:eastAsia="en-US" w:bidi="ar-SA"/>
+        </w:rPr>
+        <w:t>Mediator</w:t>
+      </w:r>
+      <w:r>
+        <w:rPr>
+          <w:sz w:val="28"/>
+          <w:szCs w:val="28"/>
+          <w:lang w:val="en-US" w:eastAsia="en-US" w:bidi="ar-SA"/>
+        </w:rPr>
+        <w:t xml:space="preserve">; </w:t>
+      </w:r>
+    </w:p>
+    <w:p>
+      <w:pPr>
+        <w:pStyle w:val="ListParagraph"/>
+        <w:numPr>
+          <w:ilvl w:val="1"/>
+          <w:numId w:val="5"/>
+        </w:numPr>
+        <w:spacing w:line="360" w:lineRule="auto"/>
+        <w:jc w:val="both"/>
+        <w:rPr>
+          <w:sz w:val="28"/>
+          <w:szCs w:val="28"/>
+          <w:lang w:val="en-US" w:eastAsia="en-US" w:bidi="ar-SA"/>
+        </w:rPr>
+      </w:pPr>
+      <w:r>
+        <w:rPr>
+          <w:sz w:val="28"/>
+          <w:szCs w:val="28"/>
+          <w:lang w:val="en-US" w:eastAsia="en-US" w:bidi="ar-SA"/>
+        </w:rPr>
+        <w:t xml:space="preserve">Singleton; </w:t>
+      </w:r>
+    </w:p>
+    <w:p>
+      <w:pPr>
+        <w:pStyle w:val="ListParagraph"/>
+        <w:numPr>
+          <w:ilvl w:val="1"/>
+          <w:numId w:val="5"/>
+        </w:numPr>
+        <w:spacing w:line="360" w:lineRule="auto"/>
+        <w:jc w:val="both"/>
+        <w:rPr>
+          <w:sz w:val="28"/>
+          <w:szCs w:val="28"/>
+          <w:lang w:val="en-US" w:eastAsia="en-US" w:bidi="ar-SA"/>
+        </w:rPr>
+      </w:pPr>
+      <w:r>
+        <w:rPr>
+          <w:sz w:val="28"/>
+          <w:szCs w:val="28"/>
+          <w:lang w:val="en-US" w:eastAsia="en-US" w:bidi="ar-SA"/>
+        </w:rPr>
+        <w:t>Router</w:t>
+      </w:r>
+      <w:r>
+        <w:rPr>
+          <w:sz w:val="28"/>
+          <w:szCs w:val="28"/>
+          <w:lang w:val="en-US" w:eastAsia="en-US" w:bidi="ar-SA"/>
+        </w:rPr>
+        <w:t xml:space="preserve">; </w:t>
+      </w:r>
+    </w:p>
+    <w:p>
+      <w:pPr>
+        <w:pStyle w:val="ListParagraph"/>
+        <w:numPr>
+          <w:ilvl w:val="1"/>
+          <w:numId w:val="5"/>
+        </w:numPr>
+        <w:spacing w:line="360" w:lineRule="auto"/>
+        <w:jc w:val="both"/>
+        <w:rPr>
+          <w:sz w:val="28"/>
+          <w:szCs w:val="28"/>
+          <w:lang w:val="en-US" w:eastAsia="en-US" w:bidi="ar-SA"/>
+        </w:rPr>
+      </w:pPr>
+      <w:r>
+        <w:rPr>
+          <w:sz w:val="28"/>
+          <w:szCs w:val="28"/>
+          <w:lang w:val="en-US" w:eastAsia="en-US" w:bidi="ar-SA"/>
+        </w:rPr>
+        <w:t>Observer</w:t>
+      </w:r>
+      <w:r>
+        <w:rPr>
+          <w:sz w:val="28"/>
+          <w:szCs w:val="28"/>
+          <w:lang w:val="en-US" w:eastAsia="en-US" w:bidi="ar-SA"/>
+        </w:rPr>
+        <w:t xml:space="preserve">; </w:t>
+      </w:r>
+    </w:p>
+    <w:p>
+      <w:pPr>
+        <w:pStyle w:val="ListParagraph"/>
+        <w:numPr>
+          <w:ilvl w:val="1"/>
+          <w:numId w:val="5"/>
+        </w:numPr>
+        <w:spacing w:line="360" w:lineRule="auto"/>
+        <w:jc w:val="both"/>
+        <w:rPr>
+          <w:sz w:val="28"/>
+          <w:szCs w:val="28"/>
+          <w:lang w:val="en-US" w:eastAsia="en-US" w:bidi="ar-SA"/>
+        </w:rPr>
+      </w:pPr>
+      <w:r>
+        <w:rPr>
+          <w:sz w:val="28"/>
+          <w:szCs w:val="28"/>
+          <w:lang w:val="en-US" w:eastAsia="en-US" w:bidi="ar-SA"/>
+        </w:rPr>
+        <w:t xml:space="preserve">Facade; </w:t>
+      </w:r>
+    </w:p>
+    <w:p>
+      <w:pPr>
+        <w:pStyle w:val="ListParagraph"/>
+        <w:numPr>
+          <w:ilvl w:val="1"/>
+          <w:numId w:val="5"/>
+        </w:numPr>
+        <w:spacing w:line="360" w:lineRule="auto"/>
+        <w:jc w:val="both"/>
+        <w:rPr>
+          <w:sz w:val="28"/>
+          <w:szCs w:val="28"/>
+          <w:lang w:val="en-US" w:eastAsia="en-US" w:bidi="ar-SA"/>
+        </w:rPr>
+      </w:pPr>
+      <w:r>
+        <w:rPr>
+          <w:sz w:val="28"/>
+          <w:szCs w:val="28"/>
+          <w:lang w:val="en-US" w:eastAsia="en-US" w:bidi="ar-SA"/>
+        </w:rPr>
+        <w:t xml:space="preserve">Chain of Responsibility;  </w:t>
+      </w:r>
+    </w:p>
+    <w:p>
+      <w:pPr>
+        <w:pStyle w:val="ListParagraph"/>
+        <w:numPr>
+          <w:ilvl w:val="0"/>
+          <w:numId w:val="4"/>
+        </w:numPr>
+        <w:spacing w:line="360" w:lineRule="auto"/>
+        <w:jc w:val="both"/>
+        <w:rPr>
+          <w:sz w:val="28"/>
+          <w:szCs w:val="28"/>
+          <w:lang w:val="ru-RU" w:eastAsia="en-US" w:bidi="ar-SA"/>
+        </w:rPr>
+      </w:pPr>
+      <w:proofErr w:type="spellStart"/>
+      <w:r>
+        <w:rPr>
+          <w:sz w:val="28"/>
+          <w:szCs w:val="28"/>
+          <w:lang w:val="ru-RU" w:eastAsia="en-US" w:bidi="ar-SA"/>
+        </w:rPr>
+        <w:t>реалізувати</w:t>
+      </w:r>
+      <w:proofErr w:type="spellEnd"/>
+      <w:r>
+        <w:rPr>
+          <w:sz w:val="28"/>
+          <w:szCs w:val="28"/>
+          <w:lang w:val="ru-RU" w:eastAsia="en-US" w:bidi="ar-SA"/>
+        </w:rPr>
+        <w:t xml:space="preserve"> систему </w:t>
+      </w:r>
+      <w:proofErr w:type="spellStart"/>
+      <w:r>
+        <w:rPr>
+          <w:sz w:val="28"/>
+          <w:szCs w:val="28"/>
+          <w:lang w:val="ru-RU" w:eastAsia="en-US" w:bidi="ar-SA"/>
+        </w:rPr>
+        <w:t>маршрутизації</w:t>
+      </w:r>
+      <w:proofErr w:type="spellEnd"/>
+      <w:r>
+        <w:rPr>
+          <w:sz w:val="28"/>
+          <w:szCs w:val="28"/>
+          <w:lang w:val="ru-RU" w:eastAsia="en-US" w:bidi="ar-SA"/>
+        </w:rPr>
+        <w:t xml:space="preserve"> </w:t>
+      </w:r>
+      <w:r>
+        <w:rPr>
+          <w:sz w:val="28"/>
+          <w:szCs w:val="28"/>
+          <w:lang w:val="en-US" w:eastAsia="en-US" w:bidi="ar-SA"/>
+        </w:rPr>
+        <w:t>transition</w:t>
+      </w:r>
+      <w:r>
+        <w:rPr>
+          <w:sz w:val="28"/>
+          <w:szCs w:val="28"/>
+          <w:lang w:val="ru-RU" w:eastAsia="en-US" w:bidi="ar-SA"/>
+        </w:rPr>
+        <w:t>-</w:t>
+      </w:r>
+      <w:proofErr w:type="spellStart"/>
+      <w:r>
+        <w:rPr>
+          <w:sz w:val="28"/>
+          <w:szCs w:val="28"/>
+          <w:lang w:val="ru-RU" w:eastAsia="en-US" w:bidi="ar-SA"/>
+        </w:rPr>
+        <w:t>запитів</w:t>
+      </w:r>
+      <w:proofErr w:type="spellEnd"/>
+      <w:r>
+        <w:rPr>
+          <w:sz w:val="28"/>
+          <w:szCs w:val="28"/>
+          <w:lang w:val="ru-RU" w:eastAsia="en-US" w:bidi="ar-SA"/>
+        </w:rPr>
+        <w:t xml:space="preserve"> </w:t>
+      </w:r>
+      <w:proofErr w:type="spellStart"/>
+      <w:r>
+        <w:rPr>
+          <w:sz w:val="28"/>
+          <w:szCs w:val="28"/>
+          <w:lang w:val="ru-RU" w:eastAsia="en-US" w:bidi="ar-SA"/>
+        </w:rPr>
+        <w:t>між</w:t>
+      </w:r>
+      <w:proofErr w:type="spellEnd"/>
+      <w:r>
+        <w:rPr>
+          <w:sz w:val="28"/>
+          <w:szCs w:val="28"/>
+          <w:lang w:val="ru-RU" w:eastAsia="en-US" w:bidi="ar-SA"/>
+        </w:rPr>
+        <w:t xml:space="preserve"> шарами </w:t>
+      </w:r>
+      <w:proofErr w:type="spellStart"/>
+      <w:r>
+        <w:rPr>
+          <w:sz w:val="28"/>
+          <w:szCs w:val="28"/>
+          <w:lang w:val="ru-RU" w:eastAsia="en-US" w:bidi="ar-SA"/>
+        </w:rPr>
+        <w:t>застосунку</w:t>
+      </w:r>
+      <w:proofErr w:type="spellEnd"/>
+      <w:r>
+        <w:rPr>
+          <w:sz w:val="28"/>
+          <w:szCs w:val="28"/>
+          <w:lang w:val="ru-RU" w:eastAsia="en-US" w:bidi="ar-SA"/>
+        </w:rPr>
+        <w:t xml:space="preserve">; </w:t>
+      </w:r>
+    </w:p>
+    <w:p>
+      <w:pPr>
+        <w:pStyle w:val="ListParagraph"/>
+        <w:numPr>
+          <w:ilvl w:val="0"/>
+          <w:numId w:val="4"/>
+        </w:numPr>
+        <w:spacing w:line="360" w:lineRule="auto"/>
+        <w:jc w:val="both"/>
+        <w:rPr>
+          <w:sz w:val="28"/>
+          <w:szCs w:val="28"/>
+          <w:lang w:val="ru-RU" w:eastAsia="en-US" w:bidi="ar-SA"/>
+        </w:rPr>
+      </w:pPr>
+      <w:proofErr w:type="spellStart"/>
+      <w:r>
+        <w:rPr>
+          <w:sz w:val="28"/>
+          <w:szCs w:val="28"/>
+          <w:lang w:val="ru-RU" w:eastAsia="en-US" w:bidi="ar-SA"/>
+        </w:rPr>
+        <w:t>реалізувати</w:t>
+      </w:r>
+      <w:proofErr w:type="spellEnd"/>
+      <w:r>
+        <w:rPr>
+          <w:sz w:val="28"/>
+          <w:szCs w:val="28"/>
+          <w:lang w:val="ru-RU" w:eastAsia="en-US" w:bidi="ar-SA"/>
+        </w:rPr>
+        <w:t xml:space="preserve"> </w:t>
+      </w:r>
+      <w:r>
+        <w:rPr>
+          <w:sz w:val="28"/>
+          <w:szCs w:val="28"/>
+          <w:lang w:val="en-US" w:eastAsia="en-US" w:bidi="ar-SA"/>
+        </w:rPr>
+        <w:t>data</w:t>
+      </w:r>
+      <w:r>
+        <w:rPr>
+          <w:sz w:val="28"/>
+          <w:szCs w:val="28"/>
+          <w:lang w:val="ru-RU" w:eastAsia="en-US" w:bidi="ar-SA"/>
+        </w:rPr>
+        <w:t xml:space="preserve"> </w:t>
+      </w:r>
+      <w:r>
+        <w:rPr>
+          <w:sz w:val="28"/>
+          <w:szCs w:val="28"/>
+          <w:lang w:val="en-US" w:eastAsia="en-US" w:bidi="ar-SA"/>
+        </w:rPr>
+        <w:t>container</w:t>
+      </w:r>
+      <w:r>
+        <w:rPr>
+          <w:sz w:val="28"/>
+          <w:szCs w:val="28"/>
+          <w:lang w:val="ru-RU" w:eastAsia="en-US" w:bidi="ar-SA"/>
+        </w:rPr>
+        <w:t xml:space="preserve"> для </w:t>
+      </w:r>
+      <w:proofErr w:type="spellStart"/>
+      <w:r>
+        <w:rPr>
+          <w:sz w:val="28"/>
+          <w:szCs w:val="28"/>
+          <w:lang w:val="ru-RU" w:eastAsia="en-US" w:bidi="ar-SA"/>
+        </w:rPr>
+        <w:t>передачі</w:t>
+      </w:r>
+      <w:proofErr w:type="spellEnd"/>
+      <w:r>
+        <w:rPr>
+          <w:sz w:val="28"/>
+          <w:szCs w:val="28"/>
+          <w:lang w:val="ru-RU" w:eastAsia="en-US" w:bidi="ar-SA"/>
+        </w:rPr>
+        <w:t xml:space="preserve"> </w:t>
+      </w:r>
+      <w:proofErr w:type="spellStart"/>
+      <w:r>
+        <w:rPr>
+          <w:sz w:val="28"/>
+          <w:szCs w:val="28"/>
+          <w:lang w:val="ru-RU" w:eastAsia="en-US" w:bidi="ar-SA"/>
+        </w:rPr>
+        <w:t>даних</w:t>
+      </w:r>
+      <w:proofErr w:type="spellEnd"/>
+      <w:r>
+        <w:rPr>
+          <w:sz w:val="28"/>
+          <w:szCs w:val="28"/>
+          <w:lang w:val="ru-RU" w:eastAsia="en-US" w:bidi="ar-SA"/>
+        </w:rPr>
+        <w:t xml:space="preserve"> </w:t>
+      </w:r>
+      <w:proofErr w:type="spellStart"/>
+      <w:r>
+        <w:rPr>
+          <w:sz w:val="28"/>
+          <w:szCs w:val="28"/>
+          <w:lang w:val="ru-RU" w:eastAsia="en-US" w:bidi="ar-SA"/>
+        </w:rPr>
+        <w:t>між</w:t>
+      </w:r>
+      <w:proofErr w:type="spellEnd"/>
+      <w:r>
+        <w:rPr>
+          <w:sz w:val="28"/>
+          <w:szCs w:val="28"/>
+          <w:lang w:val="ru-RU" w:eastAsia="en-US" w:bidi="ar-SA"/>
+        </w:rPr>
+        <w:t xml:space="preserve"> компонентами </w:t>
+      </w:r>
+      <w:proofErr w:type="spellStart"/>
+      <w:r>
+        <w:rPr>
+          <w:sz w:val="28"/>
+          <w:szCs w:val="28"/>
+          <w:lang w:val="ru-RU" w:eastAsia="en-US" w:bidi="ar-SA"/>
+        </w:rPr>
+        <w:t>системи</w:t>
+      </w:r>
+      <w:proofErr w:type="spellEnd"/>
+      <w:r>
+        <w:rPr>
+          <w:sz w:val="28"/>
+          <w:szCs w:val="28"/>
+          <w:lang w:val="ru-RU" w:eastAsia="en-US" w:bidi="ar-SA"/>
+        </w:rPr>
+        <w:t xml:space="preserve">; </w:t>
+      </w:r>
+    </w:p>
+    <w:p>
+      <w:pPr>
+        <w:pStyle w:val="ListParagraph"/>
+        <w:numPr>
+          <w:ilvl w:val="0"/>
+          <w:numId w:val="4"/>
+        </w:numPr>
+        <w:spacing w:line="360" w:lineRule="auto"/>
+        <w:jc w:val="both"/>
+        <w:rPr>
+          <w:sz w:val="28"/>
+          <w:szCs w:val="28"/>
+          <w:lang w:val="en-US" w:eastAsia="en-US" w:bidi="ar-SA"/>
+        </w:rPr>
+      </w:pPr>
+      <w:proofErr w:type="spellStart"/>
+      <w:r>
+        <w:rPr>
+          <w:sz w:val="28"/>
+          <w:szCs w:val="28"/>
+          <w:lang w:val="en-US" w:eastAsia="en-US" w:bidi="ar-SA"/>
+        </w:rPr>
+        <w:t>розробити</w:t>
+      </w:r>
+      <w:proofErr w:type="spellEnd"/>
+      <w:r>
+        <w:rPr>
+          <w:sz w:val="28"/>
+          <w:szCs w:val="28"/>
+          <w:lang w:val="en-US" w:eastAsia="en-US" w:bidi="ar-SA"/>
+        </w:rPr>
+        <w:t xml:space="preserve"> </w:t>
+      </w:r>
+      <w:proofErr w:type="spellStart"/>
+      <w:r>
+        <w:rPr>
+          <w:sz w:val="28"/>
+          <w:szCs w:val="28"/>
+          <w:lang w:val="en-US" w:eastAsia="en-US" w:bidi="ar-SA"/>
+        </w:rPr>
+        <w:t>інтерфейс</w:t>
+      </w:r>
+      <w:proofErr w:type="spellEnd"/>
+      <w:r>
+        <w:rPr>
+          <w:sz w:val="28"/>
+          <w:szCs w:val="28"/>
+          <w:lang w:val="en-US" w:eastAsia="en-US" w:bidi="ar-SA"/>
+        </w:rPr>
+        <w:t xml:space="preserve"> </w:t>
+      </w:r>
+      <w:proofErr w:type="spellStart"/>
+      <w:r>
+        <w:rPr>
+          <w:sz w:val="28"/>
+          <w:szCs w:val="28"/>
+          <w:lang w:val="en-US" w:eastAsia="en-US" w:bidi="ar-SA"/>
+        </w:rPr>
+        <w:t>користувача</w:t>
+      </w:r>
+      <w:proofErr w:type="spellEnd"/>
+      <w:r>
+        <w:rPr>
+          <w:sz w:val="28"/>
+          <w:szCs w:val="28"/>
+          <w:lang w:val="en-US" w:eastAsia="en-US" w:bidi="ar-SA"/>
+        </w:rPr>
+        <w:t xml:space="preserve">; </w:t>
+      </w:r>
+    </w:p>
+    <w:p>
+      <w:pPr>
+        <w:pStyle w:val="ListParagraph"/>
+        <w:numPr>
+          <w:ilvl w:val="0"/>
+          <w:numId w:val="4"/>
+        </w:numPr>
+        <w:spacing w:line="360" w:lineRule="auto"/>
+        <w:jc w:val="both"/>
+        <w:rPr>
+          <w:sz w:val="28"/>
+          <w:szCs w:val="28"/>
+          <w:lang w:val="ru-RU" w:eastAsia="en-US" w:bidi="ar-SA"/>
+        </w:rPr>
+      </w:pPr>
+      <w:proofErr w:type="spellStart"/>
+      <w:r>
+        <w:rPr>
+          <w:sz w:val="28"/>
+          <w:szCs w:val="28"/>
+          <w:lang w:val="ru-RU" w:eastAsia="en-US" w:bidi="ar-SA"/>
+        </w:rPr>
+        <w:t>виконати</w:t>
+      </w:r>
+      <w:proofErr w:type="spellEnd"/>
+      <w:r>
+        <w:rPr>
+          <w:sz w:val="28"/>
+          <w:szCs w:val="28"/>
+          <w:lang w:val="ru-RU" w:eastAsia="en-US" w:bidi="ar-SA"/>
+        </w:rPr>
+        <w:t xml:space="preserve"> </w:t>
+      </w:r>
+      <w:proofErr w:type="spellStart"/>
+      <w:r>
+        <w:rPr>
+          <w:sz w:val="28"/>
+          <w:szCs w:val="28"/>
+          <w:lang w:val="ru-RU" w:eastAsia="en-US" w:bidi="ar-SA"/>
+        </w:rPr>
+        <w:t>програмну</w:t>
+      </w:r>
+      <w:proofErr w:type="spellEnd"/>
+      <w:r>
+        <w:rPr>
+          <w:sz w:val="28"/>
+          <w:szCs w:val="28"/>
+          <w:lang w:val="ru-RU" w:eastAsia="en-US" w:bidi="ar-SA"/>
+        </w:rPr>
+        <w:t xml:space="preserve"> </w:t>
+      </w:r>
+      <w:proofErr w:type="spellStart"/>
+      <w:r>
+        <w:rPr>
+          <w:sz w:val="28"/>
+          <w:szCs w:val="28"/>
+          <w:lang w:val="ru-RU" w:eastAsia="en-US" w:bidi="ar-SA"/>
+        </w:rPr>
+        <w:t>реалізацію</w:t>
+      </w:r>
+      <w:proofErr w:type="spellEnd"/>
+      <w:r>
+        <w:rPr>
+          <w:sz w:val="28"/>
+          <w:szCs w:val="28"/>
+          <w:lang w:val="ru-RU" w:eastAsia="en-US" w:bidi="ar-SA"/>
+        </w:rPr>
+        <w:t xml:space="preserve"> </w:t>
+      </w:r>
+      <w:proofErr w:type="spellStart"/>
+      <w:r>
+        <w:rPr>
+          <w:sz w:val="28"/>
+          <w:szCs w:val="28"/>
+          <w:lang w:val="ru-RU" w:eastAsia="en-US" w:bidi="ar-SA"/>
+        </w:rPr>
+        <w:t>відповідно</w:t>
+      </w:r>
+      <w:proofErr w:type="spellEnd"/>
+      <w:r>
+        <w:rPr>
+          <w:sz w:val="28"/>
+          <w:szCs w:val="28"/>
+          <w:lang w:val="ru-RU" w:eastAsia="en-US" w:bidi="ar-SA"/>
+        </w:rPr>
+        <w:t xml:space="preserve"> до </w:t>
+      </w:r>
+      <w:proofErr w:type="spellStart"/>
+      <w:r>
+        <w:rPr>
+          <w:sz w:val="28"/>
+          <w:szCs w:val="28"/>
+          <w:lang w:val="ru-RU" w:eastAsia="en-US" w:bidi="ar-SA"/>
+        </w:rPr>
+        <w:t>вимог</w:t>
+      </w:r>
+      <w:proofErr w:type="spellEnd"/>
+      <w:r>
+        <w:rPr>
+          <w:sz w:val="28"/>
+          <w:szCs w:val="28"/>
+          <w:lang w:val="ru-RU" w:eastAsia="en-US" w:bidi="ar-SA"/>
+        </w:rPr>
+        <w:t xml:space="preserve"> </w:t>
+      </w:r>
+      <w:proofErr w:type="spellStart"/>
+      <w:r>
+        <w:rPr>
+          <w:sz w:val="28"/>
+          <w:szCs w:val="28"/>
+          <w:lang w:val="ru-RU" w:eastAsia="en-US" w:bidi="ar-SA"/>
+        </w:rPr>
+        <w:t>технічного</w:t>
+      </w:r>
+      <w:proofErr w:type="spellEnd"/>
+      <w:r>
+        <w:rPr>
+          <w:sz w:val="28"/>
+          <w:szCs w:val="28"/>
+          <w:lang w:val="ru-RU" w:eastAsia="en-US" w:bidi="ar-SA"/>
+        </w:rPr>
+        <w:t xml:space="preserve"> </w:t>
+      </w:r>
+      <w:proofErr w:type="spellStart"/>
+      <w:r>
+        <w:rPr>
+          <w:sz w:val="28"/>
+          <w:szCs w:val="28"/>
+          <w:lang w:val="ru-RU" w:eastAsia="en-US" w:bidi="ar-SA"/>
+        </w:rPr>
+        <w:t>завдання</w:t>
+      </w:r>
+      <w:proofErr w:type="spellEnd"/>
+      <w:r>
+        <w:rPr>
+          <w:sz w:val="28"/>
+          <w:szCs w:val="28"/>
+          <w:lang w:val="ru-RU" w:eastAsia="en-US" w:bidi="ar-SA"/>
+        </w:rPr>
+        <w:t xml:space="preserve">; </w:t>
+      </w:r>
+    </w:p>
+    <w:p>
+      <w:pPr>
+        <w:pStyle w:val="ListParagraph"/>
+        <w:numPr>
+          <w:ilvl w:val="0"/>
+          <w:numId w:val="4"/>
+        </w:numPr>
+        <w:spacing w:line="360" w:lineRule="auto"/>
+        <w:jc w:val="both"/>
+        <w:rPr>
+          <w:sz w:val="28"/>
+          <w:szCs w:val="28"/>
+          <w:lang w:val="en-US" w:eastAsia="en-US" w:bidi="ar-SA"/>
+        </w:rPr>
+      </w:pPr>
+      <w:proofErr w:type="spellStart"/>
+      <w:r>
+        <w:rPr>
+          <w:sz w:val="28"/>
+          <w:szCs w:val="28"/>
+          <w:lang w:val="en-US" w:eastAsia="en-US" w:bidi="ar-SA"/>
+        </w:rPr>
+        <w:t>виконати</w:t>
+      </w:r>
+      <w:proofErr w:type="spellEnd"/>
+      <w:r>
+        <w:rPr>
+          <w:sz w:val="28"/>
+          <w:szCs w:val="28"/>
+          <w:lang w:val="en-US" w:eastAsia="en-US" w:bidi="ar-SA"/>
+        </w:rPr>
+        <w:t xml:space="preserve"> </w:t>
+      </w:r>
+      <w:proofErr w:type="spellStart"/>
+      <w:r>
+        <w:rPr>
+          <w:sz w:val="28"/>
+          <w:szCs w:val="28"/>
+          <w:lang w:val="en-US" w:eastAsia="en-US" w:bidi="ar-SA"/>
+        </w:rPr>
+        <w:t>тестування</w:t>
+      </w:r>
+      <w:proofErr w:type="spellEnd"/>
+      <w:r>
+        <w:rPr>
+          <w:sz w:val="28"/>
+          <w:szCs w:val="28"/>
+          <w:lang w:val="en-US" w:eastAsia="en-US" w:bidi="ar-SA"/>
+        </w:rPr>
+        <w:t xml:space="preserve"> </w:t>
+      </w:r>
+      <w:proofErr w:type="spellStart"/>
+      <w:r>
+        <w:rPr>
+          <w:sz w:val="28"/>
+          <w:szCs w:val="28"/>
+          <w:lang w:val="en-US" w:eastAsia="en-US" w:bidi="ar-SA"/>
+        </w:rPr>
+        <w:t>програмного</w:t>
+      </w:r>
+      <w:proofErr w:type="spellEnd"/>
+      <w:r>
+        <w:rPr>
+          <w:sz w:val="28"/>
+          <w:szCs w:val="28"/>
+          <w:lang w:val="en-US" w:eastAsia="en-US" w:bidi="ar-SA"/>
+        </w:rPr>
+        <w:t xml:space="preserve"> </w:t>
+      </w:r>
+      <w:proofErr w:type="spellStart"/>
+      <w:r>
+        <w:rPr>
+          <w:sz w:val="28"/>
+          <w:szCs w:val="28"/>
+          <w:lang w:val="en-US" w:eastAsia="en-US" w:bidi="ar-SA"/>
+        </w:rPr>
+        <w:t>забезпечення</w:t>
+      </w:r>
+      <w:proofErr w:type="spellEnd"/>
+      <w:r>
+        <w:rPr>
+          <w:sz w:val="28"/>
+          <w:szCs w:val="28"/>
+          <w:lang w:val="en-US" w:eastAsia="en-US" w:bidi="ar-SA"/>
+        </w:rPr>
+        <w:t xml:space="preserve">; </w:t>
+      </w:r>
+    </w:p>
+    <w:p>
+      <w:pPr>
+        <w:pStyle w:val="ListParagraph"/>
+        <w:numPr>
+          <w:ilvl w:val="0"/>
+          <w:numId w:val="4"/>
+        </w:numPr>
+        <w:spacing w:line="360" w:lineRule="auto"/>
+        <w:jc w:val="both"/>
+        <w:rPr>
+          <w:sz w:val="28"/>
+          <w:szCs w:val="28"/>
+          <w:lang w:val="ru-RU" w:eastAsia="en-US" w:bidi="ar-SA"/>
+        </w:rPr>
+      </w:pPr>
+      <w:proofErr w:type="spellStart"/>
+      <w:r>
+        <w:rPr>
+          <w:sz w:val="28"/>
+          <w:szCs w:val="28"/>
+          <w:lang w:val="ru-RU" w:eastAsia="en-US" w:bidi="ar-SA"/>
+        </w:rPr>
+        <w:t>оформити</w:t>
+      </w:r>
+      <w:proofErr w:type="spellEnd"/>
+      <w:r>
+        <w:rPr>
+          <w:sz w:val="28"/>
+          <w:szCs w:val="28"/>
+          <w:lang w:val="ru-RU" w:eastAsia="en-US" w:bidi="ar-SA"/>
+        </w:rPr>
+        <w:t xml:space="preserve"> </w:t>
+      </w:r>
+      <w:proofErr w:type="spellStart"/>
+      <w:r>
+        <w:rPr>
+          <w:sz w:val="28"/>
+          <w:szCs w:val="28"/>
+          <w:lang w:val="ru-RU" w:eastAsia="en-US" w:bidi="ar-SA"/>
+        </w:rPr>
+        <w:t>документацію</w:t>
+      </w:r>
+      <w:proofErr w:type="spellEnd"/>
+      <w:r>
+        <w:rPr>
+          <w:sz w:val="28"/>
+          <w:szCs w:val="28"/>
+          <w:lang w:val="ru-RU" w:eastAsia="en-US" w:bidi="ar-SA"/>
+        </w:rPr>
+        <w:t xml:space="preserve"> до </w:t>
+      </w:r>
+      <w:r>
+        <w:rPr>
+          <w:sz w:val="28"/>
+          <w:szCs w:val="28"/>
+          <w:lang w:val="ru-RU" w:eastAsia="en-US" w:bidi="ar-SA"/>
+        </w:rPr>
+        <w:t xml:space="preserve">курсового </w:t>
+      </w:r>
+      <w:proofErr w:type="spellStart"/>
+      <w:r>
+        <w:rPr>
+          <w:sz w:val="28"/>
+          <w:szCs w:val="28"/>
+          <w:lang w:val="ru-RU" w:eastAsia="en-US" w:bidi="ar-SA"/>
+        </w:rPr>
+        <w:t>проєкту</w:t>
+      </w:r>
+      <w:proofErr w:type="spellEnd"/>
+      <w:r>
+        <w:rPr>
+          <w:sz w:val="28"/>
+          <w:szCs w:val="28"/>
+          <w:lang w:val="ru-RU" w:eastAsia="en-US" w:bidi="ar-SA"/>
+        </w:rPr>
+        <w:t xml:space="preserve">. </w:t>
       </w:r>
     </w:p>
     <w:p>
@@ -611,1597 +2296,7 @@
         </w:tabs>
         <w:spacing w:before="160" w:line="360" w:lineRule="auto"/>
         <w:ind w:left="0" w:firstLine="567"/>
-        <w:rPr>
-          <w:color w:val="000000"/>
-          <w:sz w:val="28"/>
-          <w:szCs w:val="28"/>
-        </w:rPr>
-      </w:pPr>
-      <w:r>
-        <w:rPr>
-          <w:b/>
-          <w:color w:val="000000"/>
-          <w:sz w:val="28"/>
-          <w:szCs w:val="28"/>
-        </w:rPr>
-        <w:t xml:space="preserve">Вихідні дані для роботи: </w:t>
-      </w:r>
-      <w:r>
-        <w:rPr>
-          <w:color w:val="000000"/>
-          <w:sz w:val="28"/>
-          <w:szCs w:val="28"/>
-        </w:rPr>
-        <w:t>див. Технічне завдання.</w:t>
-      </w:r>
-    </w:p>
-    <w:p>
-      <w:pPr>
-        <w:numPr>
-          <w:ilvl w:val="1"/>
-          <w:numId w:val="2"/>
-        </w:numPr>
-        <w:pBdr>
-          <w:top w:val="nil"/>
-          <w:left w:val="nil"/>
-          <w:bottom w:val="nil"/>
-          <w:right w:val="nil"/>
-          <w:between w:val="nil"/>
-        </w:pBdr>
-        <w:tabs>
-          <w:tab w:val="left" w:pos="1066"/>
-        </w:tabs>
-        <w:spacing w:before="161" w:line="360" w:lineRule="auto"/>
-        <w:ind w:left="0" w:firstLine="567"/>
-        <w:rPr>
-          <w:b/>
-          <w:color w:val="000000"/>
-          <w:sz w:val="28"/>
-          <w:szCs w:val="28"/>
-        </w:rPr>
-      </w:pPr>
-      <w:r>
-        <w:rPr>
-          <w:b/>
-          <w:color w:val="000000"/>
-          <w:sz w:val="28"/>
-          <w:szCs w:val="28"/>
-        </w:rPr>
-        <w:t>Перелік завдань, які мають бути вирішені:</w:t>
-      </w:r>
-    </w:p>
-    <w:p>
-      <w:pPr>
-        <w:pStyle w:val="ListParagraph"/>
-        <w:numPr>
-          <w:ilvl w:val="0"/>
-          <w:numId w:val="4"/>
-        </w:numPr>
         <w:jc w:val="both"/>
-        <w:rPr>
-          <w:sz w:val="28"/>
-          <w:szCs w:val="28"/>
-          <w:lang w:val="ru-RU" w:eastAsia="en-US" w:bidi="ar-SA"/>
-        </w:rPr>
-      </w:pPr>
-      <w:r>
-        <w:rPr>
-          <w:sz w:val="28"/>
-          <w:szCs w:val="28"/>
-          <w:lang w:val="ru-RU" w:eastAsia="en-US" w:bidi="ar-SA"/>
-        </w:rPr>
-        <w:t xml:space="preserve">за </w:t>
-      </w:r>
-      <w:proofErr w:type="spellStart"/>
-      <w:r>
-        <w:rPr>
-          <w:sz w:val="28"/>
-          <w:szCs w:val="28"/>
-          <w:lang w:val="ru-RU" w:eastAsia="en-US" w:bidi="ar-SA"/>
-        </w:rPr>
-        <w:t>допомогою</w:t>
-      </w:r>
-      <w:proofErr w:type="spellEnd"/>
-      <w:r>
-        <w:rPr>
-          <w:sz w:val="28"/>
-          <w:szCs w:val="28"/>
-          <w:lang w:val="ru-RU" w:eastAsia="en-US" w:bidi="ar-SA"/>
-        </w:rPr>
-        <w:t xml:space="preserve"> </w:t>
-      </w:r>
-      <w:proofErr w:type="spellStart"/>
-      <w:r>
-        <w:rPr>
-          <w:sz w:val="28"/>
-          <w:szCs w:val="28"/>
-          <w:lang w:val="ru-RU" w:eastAsia="en-US" w:bidi="ar-SA"/>
-        </w:rPr>
-        <w:t>принципів</w:t>
-      </w:r>
-      <w:proofErr w:type="spellEnd"/>
-      <w:r>
-        <w:rPr>
-          <w:sz w:val="28"/>
-          <w:szCs w:val="28"/>
-          <w:lang w:val="ru-RU" w:eastAsia="en-US" w:bidi="ar-SA"/>
-        </w:rPr>
-        <w:t xml:space="preserve"> ООП </w:t>
-      </w:r>
-      <w:proofErr w:type="spellStart"/>
-      <w:r>
-        <w:rPr>
-          <w:sz w:val="28"/>
-          <w:szCs w:val="28"/>
-          <w:lang w:val="ru-RU" w:eastAsia="en-US" w:bidi="ar-SA"/>
-        </w:rPr>
-        <w:t>розробити</w:t>
-      </w:r>
-      <w:proofErr w:type="spellEnd"/>
-      <w:r>
-        <w:rPr>
-          <w:sz w:val="28"/>
-          <w:szCs w:val="28"/>
-          <w:lang w:val="ru-RU" w:eastAsia="en-US" w:bidi="ar-SA"/>
-        </w:rPr>
-        <w:t xml:space="preserve"> </w:t>
-      </w:r>
-      <w:proofErr w:type="spellStart"/>
-      <w:r>
-        <w:rPr>
-          <w:sz w:val="28"/>
-          <w:szCs w:val="28"/>
-          <w:lang w:val="ru-RU" w:eastAsia="en-US" w:bidi="ar-SA"/>
-        </w:rPr>
-        <w:t>багатошарову</w:t>
-      </w:r>
-      <w:proofErr w:type="spellEnd"/>
-      <w:r>
-        <w:rPr>
-          <w:sz w:val="28"/>
-          <w:szCs w:val="28"/>
-          <w:lang w:val="ru-RU" w:eastAsia="en-US" w:bidi="ar-SA"/>
-        </w:rPr>
-        <w:t xml:space="preserve"> </w:t>
-      </w:r>
-      <w:proofErr w:type="spellStart"/>
-      <w:r>
-        <w:rPr>
-          <w:sz w:val="28"/>
-          <w:szCs w:val="28"/>
-          <w:lang w:val="ru-RU" w:eastAsia="en-US" w:bidi="ar-SA"/>
-        </w:rPr>
-        <w:t>архітектуру</w:t>
-      </w:r>
-      <w:proofErr w:type="spellEnd"/>
-      <w:r>
-        <w:rPr>
-          <w:sz w:val="28"/>
-          <w:szCs w:val="28"/>
-          <w:lang w:val="ru-RU" w:eastAsia="en-US" w:bidi="ar-SA"/>
-        </w:rPr>
-        <w:t xml:space="preserve"> </w:t>
-      </w:r>
-      <w:proofErr w:type="spellStart"/>
-      <w:r>
-        <w:rPr>
-          <w:sz w:val="28"/>
-          <w:szCs w:val="28"/>
-          <w:lang w:val="ru-RU" w:eastAsia="en-US" w:bidi="ar-SA"/>
-        </w:rPr>
-        <w:t>програмного</w:t>
-      </w:r>
-      <w:proofErr w:type="spellEnd"/>
-      <w:r>
-        <w:rPr>
-          <w:sz w:val="28"/>
-          <w:szCs w:val="28"/>
-          <w:lang w:val="ru-RU" w:eastAsia="en-US" w:bidi="ar-SA"/>
-        </w:rPr>
-        <w:t xml:space="preserve"> </w:t>
-      </w:r>
-      <w:proofErr w:type="spellStart"/>
-      <w:r>
-        <w:rPr>
-          <w:sz w:val="28"/>
-          <w:szCs w:val="28"/>
-          <w:lang w:val="ru-RU" w:eastAsia="en-US" w:bidi="ar-SA"/>
-        </w:rPr>
-        <w:t>забезпечення</w:t>
-      </w:r>
-      <w:proofErr w:type="spellEnd"/>
-      <w:r>
-        <w:rPr>
-          <w:sz w:val="28"/>
-          <w:szCs w:val="28"/>
-          <w:lang w:val="ru-RU" w:eastAsia="en-US" w:bidi="ar-SA"/>
-        </w:rPr>
-        <w:t xml:space="preserve">; </w:t>
-      </w:r>
-    </w:p>
-    <w:p>
-      <w:pPr>
-        <w:pStyle w:val="ListParagraph"/>
-        <w:numPr>
-          <w:ilvl w:val="0"/>
-          <w:numId w:val="4"/>
-        </w:numPr>
-        <w:jc w:val="both"/>
-        <w:rPr>
-          <w:sz w:val="28"/>
-          <w:szCs w:val="28"/>
-          <w:lang w:val="ru-RU" w:eastAsia="en-US" w:bidi="ar-SA"/>
-        </w:rPr>
-      </w:pPr>
-      <w:proofErr w:type="spellStart"/>
-      <w:r>
-        <w:rPr>
-          <w:sz w:val="28"/>
-          <w:szCs w:val="28"/>
-          <w:lang w:val="ru-RU" w:eastAsia="en-US" w:bidi="ar-SA"/>
-        </w:rPr>
-        <w:t>реалізувати</w:t>
-      </w:r>
-      <w:proofErr w:type="spellEnd"/>
-      <w:r>
-        <w:rPr>
-          <w:sz w:val="28"/>
-          <w:szCs w:val="28"/>
-          <w:lang w:val="ru-RU" w:eastAsia="en-US" w:bidi="ar-SA"/>
-        </w:rPr>
-        <w:t xml:space="preserve"> систему </w:t>
-      </w:r>
-      <w:r>
-        <w:rPr>
-          <w:sz w:val="28"/>
-          <w:szCs w:val="28"/>
-          <w:lang w:val="en-US" w:eastAsia="en-US" w:bidi="ar-SA"/>
-        </w:rPr>
-        <w:t>Login</w:t>
-      </w:r>
-      <w:r>
-        <w:rPr>
-          <w:sz w:val="28"/>
-          <w:szCs w:val="28"/>
-          <w:lang w:val="ru-RU" w:eastAsia="en-US" w:bidi="ar-SA"/>
-        </w:rPr>
-        <w:t xml:space="preserve"> </w:t>
-      </w:r>
-      <w:r>
-        <w:rPr>
-          <w:sz w:val="28"/>
-          <w:szCs w:val="28"/>
-          <w:lang w:val="en-US" w:eastAsia="en-US" w:bidi="ar-SA"/>
-        </w:rPr>
-        <w:t>Transition</w:t>
-      </w:r>
-      <w:r>
-        <w:rPr>
-          <w:sz w:val="28"/>
-          <w:szCs w:val="28"/>
-          <w:lang w:val="ru-RU" w:eastAsia="en-US" w:bidi="ar-SA"/>
-        </w:rPr>
-        <w:t xml:space="preserve"> </w:t>
-      </w:r>
-      <w:proofErr w:type="spellStart"/>
-      <w:r>
-        <w:rPr>
-          <w:sz w:val="28"/>
-          <w:szCs w:val="28"/>
-          <w:lang w:val="ru-RU" w:eastAsia="en-US" w:bidi="ar-SA"/>
-        </w:rPr>
-        <w:t>із</w:t>
-      </w:r>
-      <w:proofErr w:type="spellEnd"/>
-      <w:r>
-        <w:rPr>
-          <w:sz w:val="28"/>
-          <w:szCs w:val="28"/>
-          <w:lang w:val="ru-RU" w:eastAsia="en-US" w:bidi="ar-SA"/>
-        </w:rPr>
-        <w:t xml:space="preserve"> </w:t>
-      </w:r>
-      <w:proofErr w:type="spellStart"/>
-      <w:r>
-        <w:rPr>
-          <w:sz w:val="28"/>
-          <w:szCs w:val="28"/>
-          <w:lang w:val="ru-RU" w:eastAsia="en-US" w:bidi="ar-SA"/>
-        </w:rPr>
-        <w:t>використанням</w:t>
-      </w:r>
-      <w:proofErr w:type="spellEnd"/>
-      <w:r>
-        <w:rPr>
-          <w:sz w:val="28"/>
-          <w:szCs w:val="28"/>
-          <w:lang w:val="ru-RU" w:eastAsia="en-US" w:bidi="ar-SA"/>
-        </w:rPr>
-        <w:t xml:space="preserve"> </w:t>
-      </w:r>
-      <w:r>
-        <w:rPr>
-          <w:sz w:val="28"/>
-          <w:szCs w:val="28"/>
-          <w:lang w:val="en-US" w:eastAsia="en-US" w:bidi="ar-SA"/>
-        </w:rPr>
-        <w:t>WPF</w:t>
-      </w:r>
-      <w:r>
-        <w:rPr>
-          <w:sz w:val="28"/>
-          <w:szCs w:val="28"/>
-          <w:lang w:val="ru-RU" w:eastAsia="en-US" w:bidi="ar-SA"/>
-        </w:rPr>
-        <w:t xml:space="preserve"> та </w:t>
-      </w:r>
-      <w:r>
-        <w:rPr>
-          <w:sz w:val="28"/>
-          <w:szCs w:val="28"/>
-          <w:lang w:val="en-US" w:eastAsia="en-US" w:bidi="ar-SA"/>
-        </w:rPr>
-        <w:t>MVVM</w:t>
-      </w:r>
-      <w:r>
-        <w:rPr>
-          <w:sz w:val="28"/>
-          <w:szCs w:val="28"/>
-          <w:lang w:val="ru-RU" w:eastAsia="en-US" w:bidi="ar-SA"/>
-        </w:rPr>
-        <w:t xml:space="preserve">; </w:t>
-      </w:r>
-    </w:p>
-    <w:p>
-      <w:pPr>
-        <w:pStyle w:val="ListParagraph"/>
-        <w:numPr>
-          <w:ilvl w:val="0"/>
-          <w:numId w:val="4"/>
-        </w:numPr>
-        <w:jc w:val="both"/>
-        <w:rPr>
-          <w:sz w:val="28"/>
-          <w:szCs w:val="28"/>
-          <w:lang w:val="en-US" w:eastAsia="en-US" w:bidi="ar-SA"/>
-        </w:rPr>
-      </w:pPr>
-      <w:proofErr w:type="spellStart"/>
-      <w:r>
-        <w:rPr>
-          <w:sz w:val="28"/>
-          <w:szCs w:val="28"/>
-          <w:lang w:val="en-US" w:eastAsia="en-US" w:bidi="ar-SA"/>
-        </w:rPr>
-        <w:t>розробити</w:t>
-      </w:r>
-      <w:proofErr w:type="spellEnd"/>
-      <w:r>
-        <w:rPr>
-          <w:sz w:val="28"/>
-          <w:szCs w:val="28"/>
-          <w:lang w:val="en-US" w:eastAsia="en-US" w:bidi="ar-SA"/>
-        </w:rPr>
-        <w:t xml:space="preserve"> </w:t>
-      </w:r>
-      <w:proofErr w:type="spellStart"/>
-      <w:r>
-        <w:rPr>
-          <w:sz w:val="28"/>
-          <w:szCs w:val="28"/>
-          <w:lang w:val="en-US" w:eastAsia="en-US" w:bidi="ar-SA"/>
-        </w:rPr>
-        <w:t>структурну</w:t>
-      </w:r>
-      <w:proofErr w:type="spellEnd"/>
-      <w:r>
-        <w:rPr>
-          <w:sz w:val="28"/>
-          <w:szCs w:val="28"/>
-          <w:lang w:val="en-US" w:eastAsia="en-US" w:bidi="ar-SA"/>
-        </w:rPr>
-        <w:t xml:space="preserve"> </w:t>
-      </w:r>
-      <w:proofErr w:type="spellStart"/>
-      <w:r>
-        <w:rPr>
-          <w:sz w:val="28"/>
-          <w:szCs w:val="28"/>
-          <w:lang w:val="en-US" w:eastAsia="en-US" w:bidi="ar-SA"/>
-        </w:rPr>
-        <w:t>організацію</w:t>
-      </w:r>
-      <w:proofErr w:type="spellEnd"/>
-      <w:r>
-        <w:rPr>
-          <w:sz w:val="28"/>
-          <w:szCs w:val="28"/>
-          <w:lang w:val="en-US" w:eastAsia="en-US" w:bidi="ar-SA"/>
-        </w:rPr>
-        <w:t xml:space="preserve"> </w:t>
-      </w:r>
-      <w:proofErr w:type="spellStart"/>
-      <w:r>
-        <w:rPr>
-          <w:sz w:val="28"/>
-          <w:szCs w:val="28"/>
-          <w:lang w:val="en-US" w:eastAsia="en-US" w:bidi="ar-SA"/>
-        </w:rPr>
-        <w:t>застосунку</w:t>
-      </w:r>
-      <w:proofErr w:type="spellEnd"/>
-      <w:r>
-        <w:rPr>
-          <w:sz w:val="28"/>
-          <w:szCs w:val="28"/>
-          <w:lang w:val="en-US" w:eastAsia="en-US" w:bidi="ar-SA"/>
-        </w:rPr>
-        <w:t xml:space="preserve"> </w:t>
-      </w:r>
-      <w:proofErr w:type="spellStart"/>
-      <w:r>
-        <w:rPr>
-          <w:sz w:val="28"/>
-          <w:szCs w:val="28"/>
-          <w:lang w:val="en-US" w:eastAsia="en-US" w:bidi="ar-SA"/>
-        </w:rPr>
-        <w:t>та</w:t>
-      </w:r>
-      <w:proofErr w:type="spellEnd"/>
-      <w:r>
-        <w:rPr>
-          <w:sz w:val="28"/>
-          <w:szCs w:val="28"/>
-          <w:lang w:val="en-US" w:eastAsia="en-US" w:bidi="ar-SA"/>
-        </w:rPr>
-        <w:t xml:space="preserve"> </w:t>
-      </w:r>
-      <w:proofErr w:type="spellStart"/>
-      <w:r>
-        <w:rPr>
-          <w:sz w:val="28"/>
-          <w:szCs w:val="28"/>
-          <w:lang w:val="en-US" w:eastAsia="en-US" w:bidi="ar-SA"/>
-        </w:rPr>
-        <w:t>взаємодію</w:t>
-      </w:r>
-      <w:proofErr w:type="spellEnd"/>
-      <w:r>
-        <w:rPr>
-          <w:sz w:val="28"/>
-          <w:szCs w:val="28"/>
-          <w:lang w:val="en-US" w:eastAsia="en-US" w:bidi="ar-SA"/>
-        </w:rPr>
-        <w:t xml:space="preserve"> </w:t>
-      </w:r>
-      <w:proofErr w:type="spellStart"/>
-      <w:r>
-        <w:rPr>
-          <w:sz w:val="28"/>
-          <w:szCs w:val="28"/>
-          <w:lang w:val="en-US" w:eastAsia="en-US" w:bidi="ar-SA"/>
-        </w:rPr>
-        <w:t>між</w:t>
-      </w:r>
-      <w:proofErr w:type="spellEnd"/>
-      <w:r>
-        <w:rPr>
-          <w:sz w:val="28"/>
-          <w:szCs w:val="28"/>
-          <w:lang w:val="en-US" w:eastAsia="en-US" w:bidi="ar-SA"/>
-        </w:rPr>
-        <w:t xml:space="preserve"> Presentation Layer, Business Logic Layer, Data Processing Layer </w:t>
-      </w:r>
-      <w:proofErr w:type="spellStart"/>
-      <w:r>
-        <w:rPr>
-          <w:sz w:val="28"/>
-          <w:szCs w:val="28"/>
-          <w:lang w:val="en-US" w:eastAsia="en-US" w:bidi="ar-SA"/>
-        </w:rPr>
-        <w:t>та</w:t>
-      </w:r>
-      <w:proofErr w:type="spellEnd"/>
-      <w:r>
-        <w:rPr>
-          <w:sz w:val="28"/>
-          <w:szCs w:val="28"/>
-          <w:lang w:val="en-US" w:eastAsia="en-US" w:bidi="ar-SA"/>
-        </w:rPr>
-        <w:t xml:space="preserve"> Data Access Layer; </w:t>
-      </w:r>
-    </w:p>
-    <w:p>
-      <w:pPr>
-        <w:pStyle w:val="ListParagraph"/>
-        <w:numPr>
-          <w:ilvl w:val="0"/>
-          <w:numId w:val="4"/>
-        </w:numPr>
-        <w:jc w:val="both"/>
-        <w:rPr>
-          <w:sz w:val="28"/>
-          <w:szCs w:val="28"/>
-          <w:lang w:val="ru-RU" w:eastAsia="en-US" w:bidi="ar-SA"/>
-        </w:rPr>
-      </w:pPr>
-      <w:proofErr w:type="spellStart"/>
-      <w:r>
-        <w:rPr>
-          <w:sz w:val="28"/>
-          <w:szCs w:val="28"/>
-          <w:lang w:val="ru-RU" w:eastAsia="en-US" w:bidi="ar-SA"/>
-        </w:rPr>
-        <w:t>обґрунтувати</w:t>
-      </w:r>
-      <w:proofErr w:type="spellEnd"/>
-      <w:r>
-        <w:rPr>
-          <w:sz w:val="28"/>
-          <w:szCs w:val="28"/>
-          <w:lang w:val="ru-RU" w:eastAsia="en-US" w:bidi="ar-SA"/>
-        </w:rPr>
-        <w:t xml:space="preserve"> </w:t>
-      </w:r>
-      <w:proofErr w:type="spellStart"/>
-      <w:r>
-        <w:rPr>
-          <w:sz w:val="28"/>
-          <w:szCs w:val="28"/>
-          <w:lang w:val="ru-RU" w:eastAsia="en-US" w:bidi="ar-SA"/>
-        </w:rPr>
-        <w:t>вибір</w:t>
-      </w:r>
-      <w:proofErr w:type="spellEnd"/>
-      <w:r>
-        <w:rPr>
-          <w:sz w:val="28"/>
-          <w:szCs w:val="28"/>
-          <w:lang w:val="ru-RU" w:eastAsia="en-US" w:bidi="ar-SA"/>
-        </w:rPr>
-        <w:t xml:space="preserve"> </w:t>
-      </w:r>
-      <w:proofErr w:type="spellStart"/>
-      <w:r>
-        <w:rPr>
-          <w:sz w:val="28"/>
-          <w:szCs w:val="28"/>
-          <w:lang w:val="ru-RU" w:eastAsia="en-US" w:bidi="ar-SA"/>
-        </w:rPr>
-        <w:t>шаблонів</w:t>
-      </w:r>
-      <w:proofErr w:type="spellEnd"/>
-      <w:r>
-        <w:rPr>
-          <w:sz w:val="28"/>
-          <w:szCs w:val="28"/>
-          <w:lang w:val="ru-RU" w:eastAsia="en-US" w:bidi="ar-SA"/>
-        </w:rPr>
-        <w:t xml:space="preserve"> </w:t>
-      </w:r>
-      <w:proofErr w:type="spellStart"/>
-      <w:r>
-        <w:rPr>
-          <w:sz w:val="28"/>
-          <w:szCs w:val="28"/>
-          <w:lang w:val="ru-RU" w:eastAsia="en-US" w:bidi="ar-SA"/>
-        </w:rPr>
-        <w:t>проєктування</w:t>
-      </w:r>
-      <w:proofErr w:type="spellEnd"/>
-      <w:r>
-        <w:rPr>
-          <w:sz w:val="28"/>
-          <w:szCs w:val="28"/>
-          <w:lang w:val="ru-RU" w:eastAsia="en-US" w:bidi="ar-SA"/>
-        </w:rPr>
-        <w:t xml:space="preserve"> та </w:t>
-      </w:r>
-      <w:proofErr w:type="spellStart"/>
-      <w:r>
-        <w:rPr>
-          <w:sz w:val="28"/>
-          <w:szCs w:val="28"/>
-          <w:lang w:val="ru-RU" w:eastAsia="en-US" w:bidi="ar-SA"/>
-        </w:rPr>
-        <w:t>описати</w:t>
-      </w:r>
-      <w:proofErr w:type="spellEnd"/>
-      <w:r>
-        <w:rPr>
-          <w:sz w:val="28"/>
-          <w:szCs w:val="28"/>
-          <w:lang w:val="ru-RU" w:eastAsia="en-US" w:bidi="ar-SA"/>
-        </w:rPr>
-        <w:t xml:space="preserve"> </w:t>
-      </w:r>
-      <w:proofErr w:type="spellStart"/>
-      <w:r>
-        <w:rPr>
-          <w:sz w:val="28"/>
-          <w:szCs w:val="28"/>
-          <w:lang w:val="ru-RU" w:eastAsia="en-US" w:bidi="ar-SA"/>
-        </w:rPr>
-        <w:t>їх</w:t>
-      </w:r>
-      <w:proofErr w:type="spellEnd"/>
-      <w:r>
-        <w:rPr>
-          <w:sz w:val="28"/>
-          <w:szCs w:val="28"/>
-          <w:lang w:val="ru-RU" w:eastAsia="en-US" w:bidi="ar-SA"/>
-        </w:rPr>
-        <w:t xml:space="preserve"> </w:t>
-      </w:r>
-      <w:proofErr w:type="spellStart"/>
-      <w:r>
-        <w:rPr>
-          <w:sz w:val="28"/>
-          <w:szCs w:val="28"/>
-          <w:lang w:val="ru-RU" w:eastAsia="en-US" w:bidi="ar-SA"/>
-        </w:rPr>
-        <w:t>використання</w:t>
-      </w:r>
-      <w:proofErr w:type="spellEnd"/>
-      <w:r>
-        <w:rPr>
-          <w:sz w:val="28"/>
-          <w:szCs w:val="28"/>
-          <w:lang w:val="ru-RU" w:eastAsia="en-US" w:bidi="ar-SA"/>
-        </w:rPr>
-        <w:t xml:space="preserve"> у </w:t>
-      </w:r>
-      <w:proofErr w:type="spellStart"/>
-      <w:r>
-        <w:rPr>
-          <w:sz w:val="28"/>
-          <w:szCs w:val="28"/>
-          <w:lang w:val="ru-RU" w:eastAsia="en-US" w:bidi="ar-SA"/>
-        </w:rPr>
-        <w:t>програмному</w:t>
-      </w:r>
-      <w:proofErr w:type="spellEnd"/>
-      <w:r>
-        <w:rPr>
-          <w:sz w:val="28"/>
-          <w:szCs w:val="28"/>
-          <w:lang w:val="ru-RU" w:eastAsia="en-US" w:bidi="ar-SA"/>
-        </w:rPr>
-        <w:t xml:space="preserve"> </w:t>
-      </w:r>
-      <w:proofErr w:type="spellStart"/>
-      <w:r>
-        <w:rPr>
-          <w:sz w:val="28"/>
-          <w:szCs w:val="28"/>
-          <w:lang w:val="ru-RU" w:eastAsia="en-US" w:bidi="ar-SA"/>
-        </w:rPr>
-        <w:t>забезпеченні</w:t>
-      </w:r>
-      <w:proofErr w:type="spellEnd"/>
-      <w:r>
-        <w:rPr>
-          <w:sz w:val="28"/>
-          <w:szCs w:val="28"/>
-          <w:lang w:val="ru-RU" w:eastAsia="en-US" w:bidi="ar-SA"/>
-        </w:rPr>
-        <w:t xml:space="preserve">; </w:t>
-      </w:r>
-    </w:p>
-    <w:p>
-      <w:pPr>
-        <w:pStyle w:val="ListParagraph"/>
-        <w:numPr>
-          <w:ilvl w:val="0"/>
-          <w:numId w:val="4"/>
-        </w:numPr>
-        <w:jc w:val="both"/>
-        <w:rPr>
-          <w:sz w:val="28"/>
-          <w:szCs w:val="28"/>
-          <w:lang w:val="en-US" w:eastAsia="en-US" w:bidi="ar-SA"/>
-        </w:rPr>
-      </w:pPr>
-      <w:proofErr w:type="spellStart"/>
-      <w:r>
-        <w:rPr>
-          <w:sz w:val="28"/>
-          <w:szCs w:val="28"/>
-          <w:lang w:val="en-US" w:eastAsia="en-US" w:bidi="ar-SA"/>
-        </w:rPr>
-        <w:lastRenderedPageBreak/>
-        <w:t>реалізувати</w:t>
-      </w:r>
-      <w:proofErr w:type="spellEnd"/>
-      <w:r>
-        <w:rPr>
-          <w:sz w:val="28"/>
-          <w:szCs w:val="28"/>
-          <w:lang w:val="en-US" w:eastAsia="en-US" w:bidi="ar-SA"/>
-        </w:rPr>
-        <w:t xml:space="preserve"> </w:t>
-      </w:r>
-      <w:proofErr w:type="spellStart"/>
-      <w:r>
-        <w:rPr>
-          <w:sz w:val="28"/>
-          <w:szCs w:val="28"/>
-          <w:lang w:val="en-US" w:eastAsia="en-US" w:bidi="ar-SA"/>
-        </w:rPr>
-        <w:t>шаблони</w:t>
-      </w:r>
-      <w:proofErr w:type="spellEnd"/>
-      <w:r>
-        <w:rPr>
-          <w:sz w:val="28"/>
-          <w:szCs w:val="28"/>
-          <w:lang w:val="en-US" w:eastAsia="en-US" w:bidi="ar-SA"/>
-        </w:rPr>
-        <w:t xml:space="preserve"> </w:t>
-      </w:r>
-      <w:proofErr w:type="spellStart"/>
-      <w:r>
-        <w:rPr>
-          <w:sz w:val="28"/>
-          <w:szCs w:val="28"/>
-          <w:lang w:val="en-US" w:eastAsia="en-US" w:bidi="ar-SA"/>
-        </w:rPr>
-        <w:t>проєктування</w:t>
-      </w:r>
-      <w:proofErr w:type="spellEnd"/>
-      <w:r>
-        <w:rPr>
-          <w:sz w:val="28"/>
-          <w:szCs w:val="28"/>
-          <w:lang w:val="en-US" w:eastAsia="en-US" w:bidi="ar-SA"/>
-        </w:rPr>
-        <w:t>:</w:t>
-      </w:r>
-    </w:p>
-    <w:p>
-      <w:pPr>
-        <w:pStyle w:val="ListParagraph"/>
-        <w:numPr>
-          <w:ilvl w:val="1"/>
-          <w:numId w:val="5"/>
-        </w:numPr>
-        <w:jc w:val="both"/>
-        <w:rPr>
-          <w:sz w:val="28"/>
-          <w:szCs w:val="28"/>
-          <w:lang w:val="en-US" w:eastAsia="en-US" w:bidi="ar-SA"/>
-        </w:rPr>
-      </w:pPr>
-      <w:r>
-        <w:rPr>
-          <w:sz w:val="28"/>
-          <w:szCs w:val="28"/>
-          <w:lang w:val="en-US" w:eastAsia="en-US" w:bidi="ar-SA"/>
-        </w:rPr>
-        <w:t xml:space="preserve">Builder; </w:t>
-      </w:r>
-    </w:p>
-    <w:p>
-      <w:pPr>
-        <w:pStyle w:val="ListParagraph"/>
-        <w:numPr>
-          <w:ilvl w:val="1"/>
-          <w:numId w:val="5"/>
-        </w:numPr>
-        <w:jc w:val="both"/>
-        <w:rPr>
-          <w:sz w:val="28"/>
-          <w:szCs w:val="28"/>
-          <w:lang w:val="en-US" w:eastAsia="en-US" w:bidi="ar-SA"/>
-        </w:rPr>
-      </w:pPr>
-      <w:r>
-        <w:rPr>
-          <w:sz w:val="28"/>
-          <w:szCs w:val="28"/>
-          <w:lang w:val="en-US" w:eastAsia="en-US" w:bidi="ar-SA"/>
-        </w:rPr>
-        <w:t xml:space="preserve">Factory Method; </w:t>
-      </w:r>
-    </w:p>
-    <w:p>
-      <w:pPr>
-        <w:pStyle w:val="ListParagraph"/>
-        <w:numPr>
-          <w:ilvl w:val="1"/>
-          <w:numId w:val="5"/>
-        </w:numPr>
-        <w:jc w:val="both"/>
-        <w:rPr>
-          <w:sz w:val="28"/>
-          <w:szCs w:val="28"/>
-          <w:lang w:val="en-US" w:eastAsia="en-US" w:bidi="ar-SA"/>
-        </w:rPr>
-      </w:pPr>
-      <w:r>
-        <w:rPr>
-          <w:sz w:val="28"/>
-          <w:szCs w:val="28"/>
-          <w:lang w:val="en-US" w:eastAsia="en-US" w:bidi="ar-SA"/>
-        </w:rPr>
-        <w:t xml:space="preserve">Prototype; </w:t>
-      </w:r>
-    </w:p>
-    <w:p>
-      <w:pPr>
-        <w:pStyle w:val="ListParagraph"/>
-        <w:numPr>
-          <w:ilvl w:val="1"/>
-          <w:numId w:val="5"/>
-        </w:numPr>
-        <w:jc w:val="both"/>
-        <w:rPr>
-          <w:sz w:val="28"/>
-          <w:szCs w:val="28"/>
-          <w:lang w:val="en-US" w:eastAsia="en-US" w:bidi="ar-SA"/>
-        </w:rPr>
-      </w:pPr>
-      <w:r>
-        <w:rPr>
-          <w:sz w:val="28"/>
-          <w:szCs w:val="28"/>
-          <w:lang w:val="en-US" w:eastAsia="en-US" w:bidi="ar-SA"/>
-        </w:rPr>
-        <w:t xml:space="preserve">Singleton; </w:t>
-      </w:r>
-    </w:p>
-    <w:p>
-      <w:pPr>
-        <w:pStyle w:val="ListParagraph"/>
-        <w:numPr>
-          <w:ilvl w:val="1"/>
-          <w:numId w:val="5"/>
-        </w:numPr>
-        <w:jc w:val="both"/>
-        <w:rPr>
-          <w:sz w:val="28"/>
-          <w:szCs w:val="28"/>
-          <w:lang w:val="en-US" w:eastAsia="en-US" w:bidi="ar-SA"/>
-        </w:rPr>
-      </w:pPr>
-      <w:r>
-        <w:rPr>
-          <w:sz w:val="28"/>
-          <w:szCs w:val="28"/>
-          <w:lang w:val="en-US" w:eastAsia="en-US" w:bidi="ar-SA"/>
-        </w:rPr>
-        <w:t xml:space="preserve">Composite; </w:t>
-      </w:r>
-    </w:p>
-    <w:p>
-      <w:pPr>
-        <w:pStyle w:val="ListParagraph"/>
-        <w:numPr>
-          <w:ilvl w:val="1"/>
-          <w:numId w:val="5"/>
-        </w:numPr>
-        <w:jc w:val="both"/>
-        <w:rPr>
-          <w:sz w:val="28"/>
-          <w:szCs w:val="28"/>
-          <w:lang w:val="en-US" w:eastAsia="en-US" w:bidi="ar-SA"/>
-        </w:rPr>
-      </w:pPr>
-      <w:r>
-        <w:rPr>
-          <w:sz w:val="28"/>
-          <w:szCs w:val="28"/>
-          <w:lang w:val="en-US" w:eastAsia="en-US" w:bidi="ar-SA"/>
-        </w:rPr>
-        <w:t xml:space="preserve">Decorator; </w:t>
-      </w:r>
-    </w:p>
-    <w:p>
-      <w:pPr>
-        <w:pStyle w:val="ListParagraph"/>
-        <w:numPr>
-          <w:ilvl w:val="1"/>
-          <w:numId w:val="5"/>
-        </w:numPr>
-        <w:jc w:val="both"/>
-        <w:rPr>
-          <w:sz w:val="28"/>
-          <w:szCs w:val="28"/>
-          <w:lang w:val="en-US" w:eastAsia="en-US" w:bidi="ar-SA"/>
-        </w:rPr>
-      </w:pPr>
-      <w:r>
-        <w:rPr>
-          <w:sz w:val="28"/>
-          <w:szCs w:val="28"/>
-          <w:lang w:val="en-US" w:eastAsia="en-US" w:bidi="ar-SA"/>
-        </w:rPr>
-        <w:t xml:space="preserve">Facade; </w:t>
-      </w:r>
-    </w:p>
-    <w:p>
-      <w:pPr>
-        <w:pStyle w:val="ListParagraph"/>
-        <w:numPr>
-          <w:ilvl w:val="1"/>
-          <w:numId w:val="5"/>
-        </w:numPr>
-        <w:jc w:val="both"/>
-        <w:rPr>
-          <w:sz w:val="28"/>
-          <w:szCs w:val="28"/>
-          <w:lang w:val="en-US" w:eastAsia="en-US" w:bidi="ar-SA"/>
-        </w:rPr>
-      </w:pPr>
-      <w:r>
-        <w:rPr>
-          <w:sz w:val="28"/>
-          <w:szCs w:val="28"/>
-          <w:lang w:val="en-US" w:eastAsia="en-US" w:bidi="ar-SA"/>
-        </w:rPr>
-        <w:t xml:space="preserve">Chain of Responsibility;  </w:t>
-      </w:r>
-    </w:p>
-    <w:p>
-      <w:pPr>
-        <w:pStyle w:val="ListParagraph"/>
-        <w:numPr>
-          <w:ilvl w:val="0"/>
-          <w:numId w:val="4"/>
-        </w:numPr>
-        <w:jc w:val="both"/>
-        <w:rPr>
-          <w:sz w:val="28"/>
-          <w:szCs w:val="28"/>
-          <w:lang w:val="ru-RU" w:eastAsia="en-US" w:bidi="ar-SA"/>
-        </w:rPr>
-      </w:pPr>
-      <w:proofErr w:type="spellStart"/>
-      <w:r>
-        <w:rPr>
-          <w:sz w:val="28"/>
-          <w:szCs w:val="28"/>
-          <w:lang w:val="ru-RU" w:eastAsia="en-US" w:bidi="ar-SA"/>
-        </w:rPr>
-        <w:t>реалізувати</w:t>
-      </w:r>
-      <w:proofErr w:type="spellEnd"/>
-      <w:r>
-        <w:rPr>
-          <w:sz w:val="28"/>
-          <w:szCs w:val="28"/>
-          <w:lang w:val="ru-RU" w:eastAsia="en-US" w:bidi="ar-SA"/>
-        </w:rPr>
-        <w:t xml:space="preserve"> систему </w:t>
-      </w:r>
-      <w:proofErr w:type="spellStart"/>
-      <w:r>
-        <w:rPr>
-          <w:sz w:val="28"/>
-          <w:szCs w:val="28"/>
-          <w:lang w:val="ru-RU" w:eastAsia="en-US" w:bidi="ar-SA"/>
-        </w:rPr>
-        <w:t>маршрутизації</w:t>
-      </w:r>
-      <w:proofErr w:type="spellEnd"/>
-      <w:r>
-        <w:rPr>
-          <w:sz w:val="28"/>
-          <w:szCs w:val="28"/>
-          <w:lang w:val="ru-RU" w:eastAsia="en-US" w:bidi="ar-SA"/>
-        </w:rPr>
-        <w:t xml:space="preserve"> </w:t>
-      </w:r>
-      <w:r>
-        <w:rPr>
-          <w:sz w:val="28"/>
-          <w:szCs w:val="28"/>
-          <w:lang w:val="en-US" w:eastAsia="en-US" w:bidi="ar-SA"/>
-        </w:rPr>
-        <w:t>transition</w:t>
-      </w:r>
-      <w:r>
-        <w:rPr>
-          <w:sz w:val="28"/>
-          <w:szCs w:val="28"/>
-          <w:lang w:val="ru-RU" w:eastAsia="en-US" w:bidi="ar-SA"/>
-        </w:rPr>
-        <w:t>-</w:t>
-      </w:r>
-      <w:proofErr w:type="spellStart"/>
-      <w:r>
-        <w:rPr>
-          <w:sz w:val="28"/>
-          <w:szCs w:val="28"/>
-          <w:lang w:val="ru-RU" w:eastAsia="en-US" w:bidi="ar-SA"/>
-        </w:rPr>
-        <w:t>запитів</w:t>
-      </w:r>
-      <w:proofErr w:type="spellEnd"/>
-      <w:r>
-        <w:rPr>
-          <w:sz w:val="28"/>
-          <w:szCs w:val="28"/>
-          <w:lang w:val="ru-RU" w:eastAsia="en-US" w:bidi="ar-SA"/>
-        </w:rPr>
-        <w:t xml:space="preserve"> </w:t>
-      </w:r>
-      <w:proofErr w:type="spellStart"/>
-      <w:r>
-        <w:rPr>
-          <w:sz w:val="28"/>
-          <w:szCs w:val="28"/>
-          <w:lang w:val="ru-RU" w:eastAsia="en-US" w:bidi="ar-SA"/>
-        </w:rPr>
-        <w:t>між</w:t>
-      </w:r>
-      <w:proofErr w:type="spellEnd"/>
-      <w:r>
-        <w:rPr>
-          <w:sz w:val="28"/>
-          <w:szCs w:val="28"/>
-          <w:lang w:val="ru-RU" w:eastAsia="en-US" w:bidi="ar-SA"/>
-        </w:rPr>
-        <w:t xml:space="preserve"> шарами </w:t>
-      </w:r>
-      <w:proofErr w:type="spellStart"/>
-      <w:r>
-        <w:rPr>
-          <w:sz w:val="28"/>
-          <w:szCs w:val="28"/>
-          <w:lang w:val="ru-RU" w:eastAsia="en-US" w:bidi="ar-SA"/>
-        </w:rPr>
-        <w:t>застосунку</w:t>
-      </w:r>
-      <w:proofErr w:type="spellEnd"/>
-      <w:r>
-        <w:rPr>
-          <w:sz w:val="28"/>
-          <w:szCs w:val="28"/>
-          <w:lang w:val="ru-RU" w:eastAsia="en-US" w:bidi="ar-SA"/>
-        </w:rPr>
-        <w:t xml:space="preserve">; </w:t>
-      </w:r>
-    </w:p>
-    <w:p>
-      <w:pPr>
-        <w:pStyle w:val="ListParagraph"/>
-        <w:numPr>
-          <w:ilvl w:val="0"/>
-          <w:numId w:val="4"/>
-        </w:numPr>
-        <w:jc w:val="both"/>
-        <w:rPr>
-          <w:sz w:val="28"/>
-          <w:szCs w:val="28"/>
-          <w:lang w:val="ru-RU" w:eastAsia="en-US" w:bidi="ar-SA"/>
-        </w:rPr>
-      </w:pPr>
-      <w:proofErr w:type="spellStart"/>
-      <w:r>
-        <w:rPr>
-          <w:sz w:val="28"/>
-          <w:szCs w:val="28"/>
-          <w:lang w:val="ru-RU" w:eastAsia="en-US" w:bidi="ar-SA"/>
-        </w:rPr>
-        <w:t>реалізувати</w:t>
-      </w:r>
-      <w:proofErr w:type="spellEnd"/>
-      <w:r>
-        <w:rPr>
-          <w:sz w:val="28"/>
-          <w:szCs w:val="28"/>
-          <w:lang w:val="ru-RU" w:eastAsia="en-US" w:bidi="ar-SA"/>
-        </w:rPr>
-        <w:t xml:space="preserve"> </w:t>
-      </w:r>
-      <w:r>
-        <w:rPr>
-          <w:sz w:val="28"/>
-          <w:szCs w:val="28"/>
-          <w:lang w:val="en-US" w:eastAsia="en-US" w:bidi="ar-SA"/>
-        </w:rPr>
-        <w:t>data</w:t>
-      </w:r>
-      <w:r>
-        <w:rPr>
-          <w:sz w:val="28"/>
-          <w:szCs w:val="28"/>
-          <w:lang w:val="ru-RU" w:eastAsia="en-US" w:bidi="ar-SA"/>
-        </w:rPr>
-        <w:t xml:space="preserve"> </w:t>
-      </w:r>
-      <w:r>
-        <w:rPr>
-          <w:sz w:val="28"/>
-          <w:szCs w:val="28"/>
-          <w:lang w:val="en-US" w:eastAsia="en-US" w:bidi="ar-SA"/>
-        </w:rPr>
-        <w:t>container</w:t>
-      </w:r>
-      <w:r>
-        <w:rPr>
-          <w:sz w:val="28"/>
-          <w:szCs w:val="28"/>
-          <w:lang w:val="ru-RU" w:eastAsia="en-US" w:bidi="ar-SA"/>
-        </w:rPr>
-        <w:t xml:space="preserve"> для </w:t>
-      </w:r>
-      <w:proofErr w:type="spellStart"/>
-      <w:r>
-        <w:rPr>
-          <w:sz w:val="28"/>
-          <w:szCs w:val="28"/>
-          <w:lang w:val="ru-RU" w:eastAsia="en-US" w:bidi="ar-SA"/>
-        </w:rPr>
-        <w:t>передачі</w:t>
-      </w:r>
-      <w:proofErr w:type="spellEnd"/>
-      <w:r>
-        <w:rPr>
-          <w:sz w:val="28"/>
-          <w:szCs w:val="28"/>
-          <w:lang w:val="ru-RU" w:eastAsia="en-US" w:bidi="ar-SA"/>
-        </w:rPr>
-        <w:t xml:space="preserve"> </w:t>
-      </w:r>
-      <w:proofErr w:type="spellStart"/>
-      <w:r>
-        <w:rPr>
-          <w:sz w:val="28"/>
-          <w:szCs w:val="28"/>
-          <w:lang w:val="ru-RU" w:eastAsia="en-US" w:bidi="ar-SA"/>
-        </w:rPr>
-        <w:t>даних</w:t>
-      </w:r>
-      <w:proofErr w:type="spellEnd"/>
-      <w:r>
-        <w:rPr>
-          <w:sz w:val="28"/>
-          <w:szCs w:val="28"/>
-          <w:lang w:val="ru-RU" w:eastAsia="en-US" w:bidi="ar-SA"/>
-        </w:rPr>
-        <w:t xml:space="preserve"> </w:t>
-      </w:r>
-      <w:proofErr w:type="spellStart"/>
-      <w:r>
-        <w:rPr>
-          <w:sz w:val="28"/>
-          <w:szCs w:val="28"/>
-          <w:lang w:val="ru-RU" w:eastAsia="en-US" w:bidi="ar-SA"/>
-        </w:rPr>
-        <w:t>між</w:t>
-      </w:r>
-      <w:proofErr w:type="spellEnd"/>
-      <w:r>
-        <w:rPr>
-          <w:sz w:val="28"/>
-          <w:szCs w:val="28"/>
-          <w:lang w:val="ru-RU" w:eastAsia="en-US" w:bidi="ar-SA"/>
-        </w:rPr>
-        <w:t xml:space="preserve"> компонентами </w:t>
-      </w:r>
-      <w:proofErr w:type="spellStart"/>
-      <w:r>
-        <w:rPr>
-          <w:sz w:val="28"/>
-          <w:szCs w:val="28"/>
-          <w:lang w:val="ru-RU" w:eastAsia="en-US" w:bidi="ar-SA"/>
-        </w:rPr>
-        <w:t>системи</w:t>
-      </w:r>
-      <w:proofErr w:type="spellEnd"/>
-      <w:r>
-        <w:rPr>
-          <w:sz w:val="28"/>
-          <w:szCs w:val="28"/>
-          <w:lang w:val="ru-RU" w:eastAsia="en-US" w:bidi="ar-SA"/>
-        </w:rPr>
-        <w:t xml:space="preserve">; </w:t>
-      </w:r>
-    </w:p>
-    <w:p>
-      <w:pPr>
-        <w:pStyle w:val="ListParagraph"/>
-        <w:numPr>
-          <w:ilvl w:val="0"/>
-          <w:numId w:val="4"/>
-        </w:numPr>
-        <w:jc w:val="both"/>
-        <w:rPr>
-          <w:sz w:val="28"/>
-          <w:szCs w:val="28"/>
-          <w:lang w:val="en-US" w:eastAsia="en-US" w:bidi="ar-SA"/>
-        </w:rPr>
-      </w:pPr>
-      <w:proofErr w:type="spellStart"/>
-      <w:r>
-        <w:rPr>
-          <w:sz w:val="28"/>
-          <w:szCs w:val="28"/>
-          <w:lang w:val="en-US" w:eastAsia="en-US" w:bidi="ar-SA"/>
-        </w:rPr>
-        <w:t>розробити</w:t>
-      </w:r>
-      <w:proofErr w:type="spellEnd"/>
-      <w:r>
-        <w:rPr>
-          <w:sz w:val="28"/>
-          <w:szCs w:val="28"/>
-          <w:lang w:val="en-US" w:eastAsia="en-US" w:bidi="ar-SA"/>
-        </w:rPr>
-        <w:t xml:space="preserve"> </w:t>
-      </w:r>
-      <w:proofErr w:type="spellStart"/>
-      <w:r>
-        <w:rPr>
-          <w:sz w:val="28"/>
-          <w:szCs w:val="28"/>
-          <w:lang w:val="en-US" w:eastAsia="en-US" w:bidi="ar-SA"/>
-        </w:rPr>
-        <w:t>інтерфейс</w:t>
-      </w:r>
-      <w:proofErr w:type="spellEnd"/>
-      <w:r>
-        <w:rPr>
-          <w:sz w:val="28"/>
-          <w:szCs w:val="28"/>
-          <w:lang w:val="en-US" w:eastAsia="en-US" w:bidi="ar-SA"/>
-        </w:rPr>
-        <w:t xml:space="preserve"> </w:t>
-      </w:r>
-      <w:proofErr w:type="spellStart"/>
-      <w:r>
-        <w:rPr>
-          <w:sz w:val="28"/>
-          <w:szCs w:val="28"/>
-          <w:lang w:val="en-US" w:eastAsia="en-US" w:bidi="ar-SA"/>
-        </w:rPr>
-        <w:t>користувача</w:t>
-      </w:r>
-      <w:proofErr w:type="spellEnd"/>
-      <w:r>
-        <w:rPr>
-          <w:sz w:val="28"/>
-          <w:szCs w:val="28"/>
-          <w:lang w:val="en-US" w:eastAsia="en-US" w:bidi="ar-SA"/>
-        </w:rPr>
-        <w:t xml:space="preserve">; </w:t>
-      </w:r>
-    </w:p>
-    <w:p>
-      <w:pPr>
-        <w:pStyle w:val="ListParagraph"/>
-        <w:numPr>
-          <w:ilvl w:val="0"/>
-          <w:numId w:val="4"/>
-        </w:numPr>
-        <w:jc w:val="both"/>
-        <w:rPr>
-          <w:sz w:val="28"/>
-          <w:szCs w:val="28"/>
-          <w:lang w:val="ru-RU" w:eastAsia="en-US" w:bidi="ar-SA"/>
-        </w:rPr>
-      </w:pPr>
-      <w:proofErr w:type="spellStart"/>
-      <w:r>
-        <w:rPr>
-          <w:sz w:val="28"/>
-          <w:szCs w:val="28"/>
-          <w:lang w:val="ru-RU" w:eastAsia="en-US" w:bidi="ar-SA"/>
-        </w:rPr>
-        <w:t>виконати</w:t>
-      </w:r>
-      <w:proofErr w:type="spellEnd"/>
-      <w:r>
-        <w:rPr>
-          <w:sz w:val="28"/>
-          <w:szCs w:val="28"/>
-          <w:lang w:val="ru-RU" w:eastAsia="en-US" w:bidi="ar-SA"/>
-        </w:rPr>
-        <w:t xml:space="preserve"> </w:t>
-      </w:r>
-      <w:proofErr w:type="spellStart"/>
-      <w:r>
-        <w:rPr>
-          <w:sz w:val="28"/>
-          <w:szCs w:val="28"/>
-          <w:lang w:val="ru-RU" w:eastAsia="en-US" w:bidi="ar-SA"/>
-        </w:rPr>
-        <w:t>програмну</w:t>
-      </w:r>
-      <w:proofErr w:type="spellEnd"/>
-      <w:r>
-        <w:rPr>
-          <w:sz w:val="28"/>
-          <w:szCs w:val="28"/>
-          <w:lang w:val="ru-RU" w:eastAsia="en-US" w:bidi="ar-SA"/>
-        </w:rPr>
-        <w:t xml:space="preserve"> </w:t>
-      </w:r>
-      <w:proofErr w:type="spellStart"/>
-      <w:r>
-        <w:rPr>
-          <w:sz w:val="28"/>
-          <w:szCs w:val="28"/>
-          <w:lang w:val="ru-RU" w:eastAsia="en-US" w:bidi="ar-SA"/>
-        </w:rPr>
-        <w:t>реалізацію</w:t>
-      </w:r>
-      <w:proofErr w:type="spellEnd"/>
-      <w:r>
-        <w:rPr>
-          <w:sz w:val="28"/>
-          <w:szCs w:val="28"/>
-          <w:lang w:val="ru-RU" w:eastAsia="en-US" w:bidi="ar-SA"/>
-        </w:rPr>
-        <w:t xml:space="preserve"> </w:t>
-      </w:r>
-      <w:proofErr w:type="spellStart"/>
-      <w:r>
-        <w:rPr>
-          <w:sz w:val="28"/>
-          <w:szCs w:val="28"/>
-          <w:lang w:val="ru-RU" w:eastAsia="en-US" w:bidi="ar-SA"/>
-        </w:rPr>
-        <w:t>відповідно</w:t>
-      </w:r>
-      <w:proofErr w:type="spellEnd"/>
-      <w:r>
-        <w:rPr>
-          <w:sz w:val="28"/>
-          <w:szCs w:val="28"/>
-          <w:lang w:val="ru-RU" w:eastAsia="en-US" w:bidi="ar-SA"/>
-        </w:rPr>
-        <w:t xml:space="preserve"> до </w:t>
-      </w:r>
-      <w:proofErr w:type="spellStart"/>
-      <w:r>
-        <w:rPr>
-          <w:sz w:val="28"/>
-          <w:szCs w:val="28"/>
-          <w:lang w:val="ru-RU" w:eastAsia="en-US" w:bidi="ar-SA"/>
-        </w:rPr>
-        <w:t>вимог</w:t>
-      </w:r>
-      <w:proofErr w:type="spellEnd"/>
-      <w:r>
-        <w:rPr>
-          <w:sz w:val="28"/>
-          <w:szCs w:val="28"/>
-          <w:lang w:val="ru-RU" w:eastAsia="en-US" w:bidi="ar-SA"/>
-        </w:rPr>
-        <w:t xml:space="preserve"> </w:t>
-      </w:r>
-      <w:proofErr w:type="spellStart"/>
-      <w:r>
-        <w:rPr>
-          <w:sz w:val="28"/>
-          <w:szCs w:val="28"/>
-          <w:lang w:val="ru-RU" w:eastAsia="en-US" w:bidi="ar-SA"/>
-        </w:rPr>
-        <w:t>технічного</w:t>
-      </w:r>
-      <w:proofErr w:type="spellEnd"/>
-      <w:r>
-        <w:rPr>
-          <w:sz w:val="28"/>
-          <w:szCs w:val="28"/>
-          <w:lang w:val="ru-RU" w:eastAsia="en-US" w:bidi="ar-SA"/>
-        </w:rPr>
-        <w:t xml:space="preserve"> </w:t>
-      </w:r>
-      <w:proofErr w:type="spellStart"/>
-      <w:r>
-        <w:rPr>
-          <w:sz w:val="28"/>
-          <w:szCs w:val="28"/>
-          <w:lang w:val="ru-RU" w:eastAsia="en-US" w:bidi="ar-SA"/>
-        </w:rPr>
-        <w:t>завдання</w:t>
-      </w:r>
-      <w:proofErr w:type="spellEnd"/>
-      <w:r>
-        <w:rPr>
-          <w:sz w:val="28"/>
-          <w:szCs w:val="28"/>
-          <w:lang w:val="ru-RU" w:eastAsia="en-US" w:bidi="ar-SA"/>
-        </w:rPr>
-        <w:t xml:space="preserve">; </w:t>
-      </w:r>
-    </w:p>
-    <w:p>
-      <w:pPr>
-        <w:pStyle w:val="ListParagraph"/>
-        <w:numPr>
-          <w:ilvl w:val="0"/>
-          <w:numId w:val="4"/>
-        </w:numPr>
-        <w:jc w:val="both"/>
-        <w:rPr>
-          <w:sz w:val="28"/>
-          <w:szCs w:val="28"/>
-          <w:lang w:val="en-US" w:eastAsia="en-US" w:bidi="ar-SA"/>
-        </w:rPr>
-      </w:pPr>
-      <w:proofErr w:type="spellStart"/>
-      <w:r>
-        <w:rPr>
-          <w:sz w:val="28"/>
-          <w:szCs w:val="28"/>
-          <w:lang w:val="en-US" w:eastAsia="en-US" w:bidi="ar-SA"/>
-        </w:rPr>
-        <w:t>виконати</w:t>
-      </w:r>
-      <w:proofErr w:type="spellEnd"/>
-      <w:r>
-        <w:rPr>
-          <w:sz w:val="28"/>
-          <w:szCs w:val="28"/>
-          <w:lang w:val="en-US" w:eastAsia="en-US" w:bidi="ar-SA"/>
-        </w:rPr>
-        <w:t xml:space="preserve"> </w:t>
-      </w:r>
-      <w:proofErr w:type="spellStart"/>
-      <w:r>
-        <w:rPr>
-          <w:sz w:val="28"/>
-          <w:szCs w:val="28"/>
-          <w:lang w:val="en-US" w:eastAsia="en-US" w:bidi="ar-SA"/>
-        </w:rPr>
-        <w:t>тестування</w:t>
-      </w:r>
-      <w:proofErr w:type="spellEnd"/>
-      <w:r>
-        <w:rPr>
-          <w:sz w:val="28"/>
-          <w:szCs w:val="28"/>
-          <w:lang w:val="en-US" w:eastAsia="en-US" w:bidi="ar-SA"/>
-        </w:rPr>
-        <w:t xml:space="preserve"> </w:t>
-      </w:r>
-      <w:proofErr w:type="spellStart"/>
-      <w:r>
-        <w:rPr>
-          <w:sz w:val="28"/>
-          <w:szCs w:val="28"/>
-          <w:lang w:val="en-US" w:eastAsia="en-US" w:bidi="ar-SA"/>
-        </w:rPr>
-        <w:t>програмного</w:t>
-      </w:r>
-      <w:proofErr w:type="spellEnd"/>
-      <w:r>
-        <w:rPr>
-          <w:sz w:val="28"/>
-          <w:szCs w:val="28"/>
-          <w:lang w:val="en-US" w:eastAsia="en-US" w:bidi="ar-SA"/>
-        </w:rPr>
-        <w:t xml:space="preserve"> </w:t>
-      </w:r>
-      <w:proofErr w:type="spellStart"/>
-      <w:r>
-        <w:rPr>
-          <w:sz w:val="28"/>
-          <w:szCs w:val="28"/>
-          <w:lang w:val="en-US" w:eastAsia="en-US" w:bidi="ar-SA"/>
-        </w:rPr>
-        <w:t>забезпечення</w:t>
-      </w:r>
-      <w:proofErr w:type="spellEnd"/>
-      <w:r>
-        <w:rPr>
-          <w:sz w:val="28"/>
-          <w:szCs w:val="28"/>
-          <w:lang w:val="en-US" w:eastAsia="en-US" w:bidi="ar-SA"/>
-        </w:rPr>
-        <w:t xml:space="preserve">; </w:t>
-      </w:r>
-    </w:p>
-    <w:p>
-      <w:pPr>
-        <w:pStyle w:val="ListParagraph"/>
-        <w:numPr>
-          <w:ilvl w:val="0"/>
-          <w:numId w:val="4"/>
-        </w:numPr>
-        <w:jc w:val="both"/>
-        <w:rPr>
-          <w:sz w:val="28"/>
-          <w:szCs w:val="28"/>
-          <w:lang w:val="ru-RU" w:eastAsia="en-US" w:bidi="ar-SA"/>
-        </w:rPr>
-      </w:pPr>
-      <w:proofErr w:type="spellStart"/>
-      <w:r>
-        <w:rPr>
-          <w:sz w:val="28"/>
-          <w:szCs w:val="28"/>
-          <w:lang w:val="ru-RU" w:eastAsia="en-US" w:bidi="ar-SA"/>
-        </w:rPr>
-        <w:t>оформити</w:t>
-      </w:r>
-      <w:proofErr w:type="spellEnd"/>
-      <w:r>
-        <w:rPr>
-          <w:sz w:val="28"/>
-          <w:szCs w:val="28"/>
-          <w:lang w:val="ru-RU" w:eastAsia="en-US" w:bidi="ar-SA"/>
-        </w:rPr>
-        <w:t xml:space="preserve"> </w:t>
-      </w:r>
-      <w:proofErr w:type="spellStart"/>
-      <w:r>
-        <w:rPr>
-          <w:sz w:val="28"/>
-          <w:szCs w:val="28"/>
-          <w:lang w:val="ru-RU" w:eastAsia="en-US" w:bidi="ar-SA"/>
-        </w:rPr>
-        <w:t>документацію</w:t>
-      </w:r>
-      <w:proofErr w:type="spellEnd"/>
-      <w:r>
-        <w:rPr>
-          <w:sz w:val="28"/>
-          <w:szCs w:val="28"/>
-          <w:lang w:val="ru-RU" w:eastAsia="en-US" w:bidi="ar-SA"/>
-        </w:rPr>
-        <w:t xml:space="preserve"> до </w:t>
-      </w:r>
-      <w:proofErr w:type="spellStart"/>
-      <w:r>
-        <w:rPr>
-          <w:sz w:val="28"/>
-          <w:szCs w:val="28"/>
-          <w:lang w:val="ru-RU" w:eastAsia="en-US" w:bidi="ar-SA"/>
-        </w:rPr>
-        <w:t>курсової</w:t>
-      </w:r>
-      <w:proofErr w:type="spellEnd"/>
-      <w:r>
-        <w:rPr>
-          <w:sz w:val="28"/>
-          <w:szCs w:val="28"/>
-          <w:lang w:val="ru-RU" w:eastAsia="en-US" w:bidi="ar-SA"/>
-        </w:rPr>
-        <w:t xml:space="preserve"> </w:t>
-      </w:r>
-      <w:proofErr w:type="spellStart"/>
-      <w:r>
-        <w:rPr>
-          <w:sz w:val="28"/>
-          <w:szCs w:val="28"/>
-          <w:lang w:val="ru-RU" w:eastAsia="en-US" w:bidi="ar-SA"/>
-        </w:rPr>
-        <w:t>роботи</w:t>
-      </w:r>
-      <w:proofErr w:type="spellEnd"/>
-      <w:r>
-        <w:rPr>
-          <w:sz w:val="28"/>
-          <w:szCs w:val="28"/>
-          <w:lang w:val="ru-RU" w:eastAsia="en-US" w:bidi="ar-SA"/>
-        </w:rPr>
-        <w:t xml:space="preserve">. </w:t>
-      </w:r>
-    </w:p>
-    <w:p>
-      <w:pPr>
-        <w:numPr>
-          <w:ilvl w:val="1"/>
-          <w:numId w:val="2"/>
-        </w:numPr>
-        <w:pBdr>
-          <w:top w:val="nil"/>
-          <w:left w:val="nil"/>
-          <w:bottom w:val="nil"/>
-          <w:right w:val="nil"/>
-          <w:between w:val="nil"/>
-        </w:pBdr>
-        <w:tabs>
-          <w:tab w:val="left" w:pos="1066"/>
-        </w:tabs>
-        <w:spacing w:before="160" w:line="360" w:lineRule="auto"/>
-        <w:ind w:left="0" w:firstLine="567"/>
         <w:rPr>
           <w:b/>
           <w:color w:val="000000"/>
@@ -2237,6 +2332,7 @@
           <w:tab w:val="left" w:pos="1066"/>
         </w:tabs>
         <w:spacing w:before="240" w:line="360" w:lineRule="auto"/>
+        <w:jc w:val="both"/>
         <w:rPr>
           <w:color w:val="000000"/>
           <w:sz w:val="28"/>
@@ -2270,6 +2366,7 @@
           <w:tab w:val="left" w:pos="1066"/>
         </w:tabs>
         <w:spacing w:before="240" w:line="360" w:lineRule="auto"/>
+        <w:jc w:val="both"/>
         <w:rPr>
           <w:color w:val="000000"/>
           <w:sz w:val="28"/>
@@ -2339,6 +2436,7 @@
           <w:tab w:val="left" w:pos="1066"/>
         </w:tabs>
         <w:spacing w:before="240" w:line="360" w:lineRule="auto"/>
+        <w:jc w:val="both"/>
         <w:rPr>
           <w:color w:val="000000"/>
           <w:sz w:val="28"/>
@@ -2444,6 +2542,7 @@
           <w:tab w:val="left" w:pos="1066"/>
         </w:tabs>
         <w:spacing w:before="240" w:line="360" w:lineRule="auto"/>
+        <w:jc w:val="both"/>
         <w:rPr>
           <w:color w:val="000000"/>
           <w:sz w:val="28"/>
@@ -2457,41 +2556,6 @@
           <w:szCs w:val="28"/>
         </w:rPr>
         <w:t>ілюстрації інтерфейсу користувача; схема взаємодії між шарами системи.</w:t>
-      </w:r>
-    </w:p>
-    <w:p>
-      <w:pPr>
-        <w:numPr>
-          <w:ilvl w:val="1"/>
-          <w:numId w:val="2"/>
-        </w:numPr>
-        <w:pBdr>
-          <w:top w:val="nil"/>
-          <w:left w:val="nil"/>
-          <w:bottom w:val="nil"/>
-          <w:right w:val="nil"/>
-          <w:between w:val="nil"/>
-        </w:pBdr>
-        <w:tabs>
-          <w:tab w:val="left" w:pos="1066"/>
-        </w:tabs>
-        <w:spacing w:before="160" w:line="360" w:lineRule="auto"/>
-        <w:ind w:left="0" w:firstLine="567"/>
-        <w:rPr>
-          <w:b/>
-          <w:color w:val="000000"/>
-          <w:sz w:val="28"/>
-          <w:szCs w:val="28"/>
-        </w:rPr>
-      </w:pPr>
-      <w:r>
-        <w:rPr>
-          <w:b/>
-          <w:color w:val="000000"/>
-          <w:sz w:val="28"/>
-          <w:szCs w:val="28"/>
-        </w:rPr>
-        <w:t>Перелік графічного матеріалу:</w:t>
       </w:r>
     </w:p>
     <w:p>
@@ -4068,6 +4132,7 @@
   <w:style w:type="character" w:default="1" w:styleId="DefaultParagraphFont">
     <w:name w:val="Default Paragraph Font"/>
     <w:uiPriority w:val="1"/>
+    <w:semiHidden/>
     <w:unhideWhenUsed/>
   </w:style>
   <w:style w:type="table" w:default="1" w:styleId="TableNormal">

</xml_diff>